<commit_message>
kubernetes - objects - namespace added
</commit_message>
<xml_diff>
--- a/Kubernetes/concepts/3-objects/3-objects.docx
+++ b/Kubernetes/concepts/3-objects/3-objects.docx
@@ -2,2734 +2,6 @@
 <file path=word/document.xml><?xml version="1.0" encoding="utf-8"?>
 <w:document xmlns:wpc="http://schemas.microsoft.com/office/word/2010/wordprocessingCanvas" xmlns:cx="http://schemas.microsoft.com/office/drawing/2014/chartex" xmlns:cx1="http://schemas.microsoft.com/office/drawing/2015/9/8/chartex" xmlns:cx2="http://schemas.microsoft.com/office/drawing/2015/10/21/chartex" xmlns:cx3="http://schemas.microsoft.com/office/drawing/2016/5/9/chartex" xmlns:cx4="http://schemas.microsoft.com/office/drawing/2016/5/10/chartex" xmlns:cx5="http://schemas.microsoft.com/office/drawing/2016/5/11/chartex" xmlns:cx6="http://schemas.microsoft.com/office/drawing/2016/5/12/chartex" xmlns:cx7="http://schemas.microsoft.com/office/drawing/2016/5/13/chartex" xmlns:cx8="http://schemas.microsoft.com/office/drawing/2016/5/14/chartex" xmlns:mc="http://schemas.openxmlformats.org/markup-compatibility/2006" xmlns:aink="http://schemas.microsoft.com/office/drawing/2016/ink" xmlns:am3d="http://schemas.microsoft.com/office/drawing/2017/model3d" xmlns:o="urn:schemas-microsoft-com:office:office" xmlns:oel="http://schemas.microsoft.com/office/2019/extlst" xmlns:r="http://schemas.openxmlformats.org/officeDocument/2006/relationships" xmlns:m="http://schemas.openxmlformats.org/officeDocument/2006/math" xmlns:v="urn:schemas-microsoft-com:vml" xmlns:wp14="http://schemas.microsoft.com/office/word/2010/wordprocessingDrawing" xmlns:wp="http://schemas.openxmlformats.org/drawingml/2006/wordprocessingDrawing" xmlns:w10="urn:schemas-microsoft-com:office:word" xmlns:w="http://schemas.openxmlformats.org/wordprocessingml/2006/main" xmlns:w14="http://schemas.microsoft.com/office/word/2010/wordml" xmlns:w15="http://schemas.microsoft.com/office/word/2012/wordml" xmlns:w16cex="http://schemas.microsoft.com/office/word/2018/wordml/cex" xmlns:w16cid="http://schemas.microsoft.com/office/word/2016/wordml/cid" xmlns:w16="http://schemas.microsoft.com/office/word/2018/wordml" xmlns:w16du="http://schemas.microsoft.com/office/word/2023/wordml/word16du" xmlns:w16sdtdh="http://schemas.microsoft.com/office/word/2020/wordml/sdtdatahash" xmlns:w16sdtfl="http://schemas.microsoft.com/office/word/2024/wordml/sdtformatlock" xmlns:w16se="http://schemas.microsoft.com/office/word/2015/wordml/symex" xmlns:wpg="http://schemas.microsoft.com/office/word/2010/wordprocessingGroup" xmlns:wpi="http://schemas.microsoft.com/office/word/2010/wordprocessingInk" xmlns:wne="http://schemas.microsoft.com/office/word/2006/wordml" xmlns:wps="http://schemas.microsoft.com/office/word/2010/wordprocessingShape" mc:Ignorable="w14 w15 w16se w16cid w16 w16cex w16sdtdh w16sdtfl w16du wp14">
   <w:body>
-    <w:p>
-      <w:pPr>
-        <w:spacing w:after="120"/>
-        <w:jc w:val="both"/>
-        <w:rPr>
-          <w:rFonts w:asciiTheme="majorBidi" w:hAnsiTheme="majorBidi" w:cstheme="majorBidi"/>
-          <w:b/>
-          <w:bCs/>
-          <w:sz w:val="40"/>
-          <w:szCs w:val="40"/>
-        </w:rPr>
-      </w:pPr>
-      <w:r>
-        <w:rPr>
-          <w:rFonts w:asciiTheme="majorBidi" w:hAnsiTheme="majorBidi" w:cstheme="majorBidi"/>
-          <w:b/>
-          <w:bCs/>
-          <w:sz w:val="40"/>
-          <w:szCs w:val="40"/>
-        </w:rPr>
-        <w:t>Namespace:</w:t>
-      </w:r>
-    </w:p>
-    <w:p>
-      <w:pPr>
-        <w:spacing w:after="120"/>
-        <w:jc w:val="both"/>
-        <w:rPr>
-          <w:rFonts w:asciiTheme="majorBidi" w:hAnsiTheme="majorBidi" w:cstheme="majorBidi"/>
-          <w:sz w:val="28"/>
-          <w:szCs w:val="28"/>
-        </w:rPr>
-      </w:pPr>
-      <w:r>
-        <w:rPr>
-          <w:rFonts w:asciiTheme="majorBidi" w:hAnsiTheme="majorBidi" w:cstheme="majorBidi"/>
-          <w:sz w:val="28"/>
-          <w:szCs w:val="28"/>
-        </w:rPr>
-        <w:t>A namespace in Kubernetes is a mechanism used to logically divide a cluster into separate virtual environments so that resources can be organized and isolated.</w:t>
-      </w:r>
-    </w:p>
-    <w:p>
-      <w:pPr>
-        <w:spacing w:after="120"/>
-        <w:jc w:val="both"/>
-        <w:rPr>
-          <w:rFonts w:asciiTheme="majorBidi" w:hAnsiTheme="majorBidi" w:cstheme="majorBidi"/>
-          <w:sz w:val="28"/>
-          <w:szCs w:val="28"/>
-        </w:rPr>
-      </w:pPr>
-      <w:r>
-        <w:rPr>
-          <w:rFonts w:asciiTheme="majorBidi" w:hAnsiTheme="majorBidi" w:cstheme="majorBidi"/>
-          <w:sz w:val="28"/>
-          <w:szCs w:val="28"/>
-        </w:rPr>
-        <w:t xml:space="preserve">Namespaces allow a single Kubernetes cluster to be logically divided into multiple isolated environments, which is why instructors often describe them as creating “virtual clusters” inside a cluster. Each namespace acts like a separate workspace where resources such as Pods, Services, Deployments, </w:t>
-      </w:r>
-      <w:proofErr w:type="spellStart"/>
-      <w:r>
-        <w:rPr>
-          <w:rFonts w:asciiTheme="majorBidi" w:hAnsiTheme="majorBidi" w:cstheme="majorBidi"/>
-          <w:sz w:val="28"/>
-          <w:szCs w:val="28"/>
-        </w:rPr>
-        <w:t>ConfigMaps</w:t>
-      </w:r>
-      <w:proofErr w:type="spellEnd"/>
-      <w:r>
-        <w:rPr>
-          <w:rFonts w:asciiTheme="majorBidi" w:hAnsiTheme="majorBidi" w:cstheme="majorBidi"/>
-          <w:sz w:val="28"/>
-          <w:szCs w:val="28"/>
-        </w:rPr>
-        <w:t>, and Secrets exist independently from resources in other namespaces. This means different teams, applications, or environments (for example development, testing, and production) can operate in the same physical cluster without their resources interfering with each other.</w:t>
-      </w:r>
-    </w:p>
-    <w:p>
-      <w:pPr>
-        <w:spacing w:after="120"/>
-        <w:jc w:val="both"/>
-        <w:rPr>
-          <w:rFonts w:asciiTheme="majorBidi" w:hAnsiTheme="majorBidi" w:cstheme="majorBidi"/>
-          <w:sz w:val="28"/>
-          <w:szCs w:val="28"/>
-        </w:rPr>
-      </w:pPr>
-      <w:r>
-        <w:rPr>
-          <w:rFonts w:asciiTheme="majorBidi" w:hAnsiTheme="majorBidi" w:cstheme="majorBidi"/>
-          <w:sz w:val="28"/>
-          <w:szCs w:val="28"/>
-        </w:rPr>
-        <w:t xml:space="preserve">Although namespaces do not create a real separate cluster, they provide logical isolation. Kubernetes can enforce this isolation using mechanisms such as RBAC (role-based access control) to restrict who can access a namespace, </w:t>
-      </w:r>
-      <w:proofErr w:type="spellStart"/>
-      <w:r>
-        <w:rPr>
-          <w:rFonts w:asciiTheme="majorBidi" w:hAnsiTheme="majorBidi" w:cstheme="majorBidi"/>
-          <w:sz w:val="28"/>
-          <w:szCs w:val="28"/>
-        </w:rPr>
-        <w:t>ResourceQuota</w:t>
-      </w:r>
-      <w:proofErr w:type="spellEnd"/>
-      <w:r>
-        <w:rPr>
-          <w:rFonts w:asciiTheme="majorBidi" w:hAnsiTheme="majorBidi" w:cstheme="majorBidi"/>
-          <w:sz w:val="28"/>
-          <w:szCs w:val="28"/>
-        </w:rPr>
-        <w:t xml:space="preserve"> to limit how much CPU, memory, or storage a namespace can use, and </w:t>
-      </w:r>
-      <w:proofErr w:type="spellStart"/>
-      <w:r>
-        <w:rPr>
-          <w:rFonts w:asciiTheme="majorBidi" w:hAnsiTheme="majorBidi" w:cstheme="majorBidi"/>
-          <w:sz w:val="28"/>
-          <w:szCs w:val="28"/>
-        </w:rPr>
-        <w:t>NetworkPolicies</w:t>
-      </w:r>
-      <w:proofErr w:type="spellEnd"/>
-      <w:r>
-        <w:rPr>
-          <w:rFonts w:asciiTheme="majorBidi" w:hAnsiTheme="majorBidi" w:cstheme="majorBidi"/>
-          <w:sz w:val="28"/>
-          <w:szCs w:val="28"/>
-        </w:rPr>
-        <w:t xml:space="preserve"> to control communication between namespaces. Because of these controls, namespaces can behave similarly to independent clusters while still sharing the same underlying Kubernetes infrastructure.</w:t>
-      </w:r>
-    </w:p>
-    <w:p>
-      <w:pPr>
-        <w:spacing w:after="120"/>
-        <w:jc w:val="both"/>
-        <w:rPr>
-          <w:rFonts w:asciiTheme="majorBidi" w:hAnsiTheme="majorBidi" w:cstheme="majorBidi"/>
-          <w:sz w:val="28"/>
-          <w:szCs w:val="28"/>
-          <w:u w:val="single"/>
-        </w:rPr>
-      </w:pPr>
-      <w:r>
-        <w:rPr>
-          <w:rFonts w:asciiTheme="majorBidi" w:hAnsiTheme="majorBidi" w:cstheme="majorBidi"/>
-          <w:sz w:val="28"/>
-          <w:szCs w:val="28"/>
-          <w:u w:val="single"/>
-        </w:rPr>
-        <w:t>Key points:</w:t>
-      </w:r>
-    </w:p>
-    <w:p>
-      <w:pPr>
-        <w:pStyle w:val="ListParagraph"/>
-        <w:numPr>
-          <w:ilvl w:val="0"/>
-          <w:numId w:val="4"/>
-        </w:numPr>
-        <w:ind w:left="360"/>
-        <w:jc w:val="both"/>
-        <w:rPr>
-          <w:rFonts w:asciiTheme="majorBidi" w:hAnsiTheme="majorBidi" w:cstheme="majorBidi"/>
-          <w:sz w:val="28"/>
-          <w:szCs w:val="28"/>
-        </w:rPr>
-      </w:pPr>
-      <w:r>
-        <w:rPr>
-          <w:rFonts w:asciiTheme="majorBidi" w:hAnsiTheme="majorBidi" w:cstheme="majorBidi"/>
-          <w:sz w:val="28"/>
-          <w:szCs w:val="28"/>
-        </w:rPr>
-        <w:t>It allows multiple teams, projects, or environments (for example: dev, staging, production) to share the same cluster.</w:t>
-      </w:r>
-    </w:p>
-    <w:p>
-      <w:pPr>
-        <w:pStyle w:val="ListParagraph"/>
-        <w:numPr>
-          <w:ilvl w:val="0"/>
-          <w:numId w:val="4"/>
-        </w:numPr>
-        <w:ind w:left="360"/>
-        <w:jc w:val="both"/>
-        <w:rPr>
-          <w:rFonts w:asciiTheme="majorBidi" w:hAnsiTheme="majorBidi" w:cstheme="majorBidi"/>
-          <w:sz w:val="28"/>
-          <w:szCs w:val="28"/>
-        </w:rPr>
-      </w:pPr>
-      <w:r>
-        <w:rPr>
-          <w:rFonts w:asciiTheme="majorBidi" w:hAnsiTheme="majorBidi" w:cstheme="majorBidi"/>
-          <w:sz w:val="28"/>
-          <w:szCs w:val="28"/>
-        </w:rPr>
-        <w:t xml:space="preserve">Most Kubernetes resources (Pods, Services, Deployments, </w:t>
-      </w:r>
-      <w:proofErr w:type="spellStart"/>
-      <w:r>
-        <w:rPr>
-          <w:rFonts w:asciiTheme="majorBidi" w:hAnsiTheme="majorBidi" w:cstheme="majorBidi"/>
-          <w:sz w:val="28"/>
-          <w:szCs w:val="28"/>
-        </w:rPr>
-        <w:t>ConfigMaps</w:t>
-      </w:r>
-      <w:proofErr w:type="spellEnd"/>
-      <w:r>
-        <w:rPr>
-          <w:rFonts w:asciiTheme="majorBidi" w:hAnsiTheme="majorBidi" w:cstheme="majorBidi"/>
-          <w:sz w:val="28"/>
-          <w:szCs w:val="28"/>
-        </w:rPr>
-        <w:t>, Secrets, etc.) exist inside a namespace.</w:t>
-      </w:r>
-    </w:p>
-    <w:p>
-      <w:pPr>
-        <w:pStyle w:val="ListParagraph"/>
-        <w:numPr>
-          <w:ilvl w:val="0"/>
-          <w:numId w:val="4"/>
-        </w:numPr>
-        <w:ind w:left="360"/>
-        <w:jc w:val="both"/>
-        <w:rPr>
-          <w:rFonts w:asciiTheme="majorBidi" w:hAnsiTheme="majorBidi" w:cstheme="majorBidi"/>
-          <w:sz w:val="28"/>
-          <w:szCs w:val="28"/>
-        </w:rPr>
-      </w:pPr>
-      <w:r>
-        <w:rPr>
-          <w:rFonts w:asciiTheme="majorBidi" w:hAnsiTheme="majorBidi" w:cstheme="majorBidi"/>
-          <w:sz w:val="28"/>
-          <w:szCs w:val="28"/>
-        </w:rPr>
-        <w:t xml:space="preserve">Resource names must be unique within the same namespace, but the same name can exist in different namespaces. Two different namespaces can both have a Pod named </w:t>
-      </w:r>
-      <w:proofErr w:type="spellStart"/>
-      <w:r>
-        <w:rPr>
-          <w:rFonts w:asciiTheme="majorBidi" w:hAnsiTheme="majorBidi" w:cstheme="majorBidi"/>
-          <w:sz w:val="28"/>
-          <w:szCs w:val="28"/>
-        </w:rPr>
-        <w:t>api</w:t>
-      </w:r>
-      <w:proofErr w:type="spellEnd"/>
-      <w:r>
-        <w:rPr>
-          <w:rFonts w:asciiTheme="majorBidi" w:hAnsiTheme="majorBidi" w:cstheme="majorBidi"/>
-          <w:sz w:val="28"/>
-          <w:szCs w:val="28"/>
-        </w:rPr>
-        <w:t>. These Pods do not conflict because they belong to different namespaces.</w:t>
-      </w:r>
-    </w:p>
-    <w:p>
-      <w:pPr>
-        <w:pStyle w:val="ListParagraph"/>
-        <w:numPr>
-          <w:ilvl w:val="0"/>
-          <w:numId w:val="4"/>
-        </w:numPr>
-        <w:ind w:left="360"/>
-        <w:jc w:val="both"/>
-        <w:rPr>
-          <w:rFonts w:asciiTheme="majorBidi" w:hAnsiTheme="majorBidi" w:cstheme="majorBidi"/>
-          <w:sz w:val="28"/>
-          <w:szCs w:val="28"/>
-        </w:rPr>
-      </w:pPr>
-      <w:r>
-        <w:rPr>
-          <w:rFonts w:asciiTheme="majorBidi" w:hAnsiTheme="majorBidi" w:cstheme="majorBidi"/>
-          <w:sz w:val="28"/>
-          <w:szCs w:val="28"/>
-        </w:rPr>
-        <w:t>Namespaces help with resource management, access control (RBAC), and quotas.</w:t>
-      </w:r>
-    </w:p>
-    <w:p>
-      <w:pPr>
-        <w:spacing w:after="60"/>
-        <w:jc w:val="both"/>
-        <w:rPr>
-          <w:rFonts w:asciiTheme="majorBidi" w:hAnsiTheme="majorBidi" w:cstheme="majorBidi"/>
-          <w:sz w:val="28"/>
-          <w:szCs w:val="28"/>
-        </w:rPr>
-      </w:pPr>
-      <w:r>
-        <w:rPr>
-          <w:rFonts w:asciiTheme="majorBidi" w:hAnsiTheme="majorBidi" w:cstheme="majorBidi"/>
-          <w:sz w:val="28"/>
-          <w:szCs w:val="28"/>
-        </w:rPr>
-        <w:t>Some namespaces exist by default in Kubernetes, such as:</w:t>
-      </w:r>
-    </w:p>
-    <w:p>
-      <w:pPr>
-        <w:pStyle w:val="ListParagraph"/>
-        <w:numPr>
-          <w:ilvl w:val="0"/>
-          <w:numId w:val="5"/>
-        </w:numPr>
-        <w:ind w:left="360"/>
-        <w:jc w:val="both"/>
-        <w:rPr>
-          <w:rFonts w:asciiTheme="majorBidi" w:hAnsiTheme="majorBidi" w:cstheme="majorBidi"/>
-          <w:sz w:val="28"/>
-          <w:szCs w:val="28"/>
-        </w:rPr>
-      </w:pPr>
-      <w:r>
-        <w:rPr>
-          <w:rFonts w:asciiTheme="majorBidi" w:hAnsiTheme="majorBidi" w:cstheme="majorBidi"/>
-          <w:b/>
-          <w:bCs/>
-          <w:sz w:val="28"/>
-          <w:szCs w:val="28"/>
-        </w:rPr>
-        <w:t>default</w:t>
-      </w:r>
-      <w:r>
-        <w:rPr>
-          <w:rFonts w:asciiTheme="majorBidi" w:hAnsiTheme="majorBidi" w:cstheme="majorBidi"/>
-          <w:sz w:val="28"/>
-          <w:szCs w:val="28"/>
-        </w:rPr>
-        <w:t xml:space="preserve"> </w:t>
-      </w:r>
-      <w:r>
-        <w:rPr>
-          <w:rFonts w:asciiTheme="majorBidi" w:hAnsiTheme="majorBidi" w:cstheme="majorBidi"/>
-          <w:sz w:val="28"/>
-          <w:szCs w:val="28"/>
-        </w:rPr>
-        <w:t xml:space="preserve">→ </w:t>
-      </w:r>
-      <w:r>
-        <w:rPr>
-          <w:rFonts w:asciiTheme="majorBidi" w:hAnsiTheme="majorBidi" w:cstheme="majorBidi"/>
-          <w:sz w:val="28"/>
-          <w:szCs w:val="28"/>
-        </w:rPr>
-        <w:t>used if no namespace is specified</w:t>
-      </w:r>
-      <w:r>
-        <w:rPr>
-          <w:rFonts w:asciiTheme="majorBidi" w:hAnsiTheme="majorBidi" w:cstheme="majorBidi"/>
-          <w:sz w:val="28"/>
-          <w:szCs w:val="28"/>
-        </w:rPr>
-        <w:t>.</w:t>
-      </w:r>
-    </w:p>
-    <w:p>
-      <w:pPr>
-        <w:pStyle w:val="ListParagraph"/>
-        <w:numPr>
-          <w:ilvl w:val="0"/>
-          <w:numId w:val="5"/>
-        </w:numPr>
-        <w:ind w:left="360"/>
-        <w:jc w:val="both"/>
-        <w:rPr>
-          <w:rFonts w:asciiTheme="majorBidi" w:hAnsiTheme="majorBidi" w:cstheme="majorBidi"/>
-          <w:sz w:val="28"/>
-          <w:szCs w:val="28"/>
-        </w:rPr>
-      </w:pPr>
-      <w:proofErr w:type="spellStart"/>
-      <w:r>
-        <w:rPr>
-          <w:rFonts w:asciiTheme="majorBidi" w:hAnsiTheme="majorBidi" w:cstheme="majorBidi"/>
-          <w:b/>
-          <w:bCs/>
-          <w:sz w:val="28"/>
-          <w:szCs w:val="28"/>
-        </w:rPr>
-        <w:t>kube</w:t>
-      </w:r>
-      <w:proofErr w:type="spellEnd"/>
-      <w:r>
-        <w:rPr>
-          <w:rFonts w:asciiTheme="majorBidi" w:hAnsiTheme="majorBidi" w:cstheme="majorBidi"/>
-          <w:b/>
-          <w:bCs/>
-          <w:sz w:val="28"/>
-          <w:szCs w:val="28"/>
-        </w:rPr>
-        <w:t>-system</w:t>
-      </w:r>
-      <w:r>
-        <w:rPr>
-          <w:rFonts w:asciiTheme="majorBidi" w:hAnsiTheme="majorBidi" w:cstheme="majorBidi"/>
-          <w:sz w:val="28"/>
-          <w:szCs w:val="28"/>
-        </w:rPr>
-        <w:t xml:space="preserve"> </w:t>
-      </w:r>
-      <w:r>
-        <w:rPr>
-          <w:rFonts w:asciiTheme="majorBidi" w:hAnsiTheme="majorBidi" w:cstheme="majorBidi"/>
-          <w:sz w:val="28"/>
-          <w:szCs w:val="28"/>
-        </w:rPr>
-        <w:t xml:space="preserve">→ </w:t>
-      </w:r>
-      <w:r>
-        <w:rPr>
-          <w:rFonts w:asciiTheme="majorBidi" w:hAnsiTheme="majorBidi" w:cstheme="majorBidi"/>
-          <w:sz w:val="28"/>
-          <w:szCs w:val="28"/>
-        </w:rPr>
-        <w:t>for Kubernetes system components</w:t>
-      </w:r>
-      <w:r>
-        <w:rPr>
-          <w:rFonts w:asciiTheme="majorBidi" w:hAnsiTheme="majorBidi" w:cstheme="majorBidi"/>
-          <w:sz w:val="28"/>
-          <w:szCs w:val="28"/>
-        </w:rPr>
-        <w:t>.</w:t>
-      </w:r>
-    </w:p>
-    <w:p>
-      <w:pPr>
-        <w:pStyle w:val="ListParagraph"/>
-        <w:numPr>
-          <w:ilvl w:val="0"/>
-          <w:numId w:val="5"/>
-        </w:numPr>
-        <w:ind w:left="360"/>
-        <w:jc w:val="both"/>
-        <w:rPr>
-          <w:rFonts w:asciiTheme="majorBidi" w:hAnsiTheme="majorBidi" w:cstheme="majorBidi"/>
-          <w:sz w:val="28"/>
-          <w:szCs w:val="28"/>
-        </w:rPr>
-      </w:pPr>
-      <w:proofErr w:type="spellStart"/>
-      <w:r>
-        <w:rPr>
-          <w:rFonts w:asciiTheme="majorBidi" w:hAnsiTheme="majorBidi" w:cstheme="majorBidi"/>
-          <w:b/>
-          <w:bCs/>
-          <w:sz w:val="28"/>
-          <w:szCs w:val="28"/>
-        </w:rPr>
-        <w:t>kube</w:t>
-      </w:r>
-      <w:proofErr w:type="spellEnd"/>
-      <w:r>
-        <w:rPr>
-          <w:rFonts w:asciiTheme="majorBidi" w:hAnsiTheme="majorBidi" w:cstheme="majorBidi"/>
-          <w:b/>
-          <w:bCs/>
-          <w:sz w:val="28"/>
-          <w:szCs w:val="28"/>
-        </w:rPr>
-        <w:t>-public</w:t>
-      </w:r>
-      <w:r>
-        <w:rPr>
-          <w:rFonts w:asciiTheme="majorBidi" w:hAnsiTheme="majorBidi" w:cstheme="majorBidi"/>
-          <w:sz w:val="28"/>
-          <w:szCs w:val="28"/>
-        </w:rPr>
-        <w:t xml:space="preserve"> </w:t>
-      </w:r>
-      <w:r>
-        <w:rPr>
-          <w:rFonts w:asciiTheme="majorBidi" w:hAnsiTheme="majorBidi" w:cstheme="majorBidi"/>
-          <w:sz w:val="28"/>
-          <w:szCs w:val="28"/>
-        </w:rPr>
-        <w:t xml:space="preserve">→ </w:t>
-      </w:r>
-      <w:r>
-        <w:rPr>
-          <w:rFonts w:asciiTheme="majorBidi" w:hAnsiTheme="majorBidi" w:cstheme="majorBidi"/>
-          <w:sz w:val="28"/>
-          <w:szCs w:val="28"/>
-        </w:rPr>
-        <w:t>publicly readable resources</w:t>
-      </w:r>
-      <w:r>
-        <w:rPr>
-          <w:rFonts w:asciiTheme="majorBidi" w:hAnsiTheme="majorBidi" w:cstheme="majorBidi"/>
-          <w:sz w:val="28"/>
-          <w:szCs w:val="28"/>
-        </w:rPr>
-        <w:t>.</w:t>
-      </w:r>
-    </w:p>
-    <w:p>
-      <w:pPr>
-        <w:pStyle w:val="ListParagraph"/>
-        <w:numPr>
-          <w:ilvl w:val="0"/>
-          <w:numId w:val="5"/>
-        </w:numPr>
-        <w:ind w:left="360"/>
-        <w:jc w:val="both"/>
-        <w:rPr>
-          <w:rFonts w:asciiTheme="majorBidi" w:hAnsiTheme="majorBidi" w:cstheme="majorBidi"/>
-          <w:sz w:val="28"/>
-          <w:szCs w:val="28"/>
-        </w:rPr>
-      </w:pPr>
-      <w:proofErr w:type="spellStart"/>
-      <w:r>
-        <w:rPr>
-          <w:rFonts w:asciiTheme="majorBidi" w:hAnsiTheme="majorBidi" w:cstheme="majorBidi"/>
-          <w:b/>
-          <w:bCs/>
-          <w:sz w:val="28"/>
-          <w:szCs w:val="28"/>
-        </w:rPr>
-        <w:t>kube</w:t>
-      </w:r>
-      <w:proofErr w:type="spellEnd"/>
-      <w:r>
-        <w:rPr>
-          <w:rFonts w:asciiTheme="majorBidi" w:hAnsiTheme="majorBidi" w:cstheme="majorBidi"/>
-          <w:b/>
-          <w:bCs/>
-          <w:sz w:val="28"/>
-          <w:szCs w:val="28"/>
-        </w:rPr>
-        <w:t>-node-lease</w:t>
-      </w:r>
-      <w:r>
-        <w:rPr>
-          <w:rFonts w:asciiTheme="majorBidi" w:hAnsiTheme="majorBidi" w:cstheme="majorBidi"/>
-          <w:sz w:val="28"/>
-          <w:szCs w:val="28"/>
-        </w:rPr>
-        <w:t xml:space="preserve"> </w:t>
-      </w:r>
-      <w:r>
-        <w:rPr>
-          <w:rFonts w:asciiTheme="majorBidi" w:hAnsiTheme="majorBidi" w:cstheme="majorBidi"/>
-          <w:sz w:val="28"/>
-          <w:szCs w:val="28"/>
-        </w:rPr>
-        <w:t xml:space="preserve">→ </w:t>
-      </w:r>
-      <w:r>
-        <w:rPr>
-          <w:rFonts w:asciiTheme="majorBidi" w:hAnsiTheme="majorBidi" w:cstheme="majorBidi"/>
-          <w:sz w:val="28"/>
-          <w:szCs w:val="28"/>
-        </w:rPr>
-        <w:t>used for node heartbeat information.</w:t>
-      </w:r>
-    </w:p>
-    <w:p>
-      <w:pPr>
-        <w:spacing w:after="120"/>
-        <w:jc w:val="both"/>
-        <w:rPr>
-          <w:rFonts w:asciiTheme="majorBidi" w:hAnsiTheme="majorBidi" w:cstheme="majorBidi"/>
-          <w:b/>
-          <w:bCs/>
-          <w:sz w:val="32"/>
-          <w:szCs w:val="32"/>
-        </w:rPr>
-      </w:pPr>
-      <w:r>
-        <w:rPr>
-          <w:rFonts w:asciiTheme="majorBidi" w:hAnsiTheme="majorBidi" w:cstheme="majorBidi"/>
-          <w:b/>
-          <w:bCs/>
-          <w:sz w:val="32"/>
-          <w:szCs w:val="32"/>
-        </w:rPr>
-        <w:t>Creating a Namespace</w:t>
-      </w:r>
-      <w:r>
-        <w:rPr>
-          <w:rFonts w:asciiTheme="majorBidi" w:hAnsiTheme="majorBidi" w:cstheme="majorBidi"/>
-          <w:b/>
-          <w:bCs/>
-          <w:sz w:val="32"/>
-          <w:szCs w:val="32"/>
-        </w:rPr>
-        <w:t>:</w:t>
-      </w:r>
-    </w:p>
-    <w:p>
-      <w:pPr>
-        <w:spacing w:after="120"/>
-        <w:jc w:val="both"/>
-        <w:rPr>
-          <w:rFonts w:asciiTheme="majorBidi" w:hAnsiTheme="majorBidi" w:cstheme="majorBidi"/>
-          <w:sz w:val="28"/>
-          <w:szCs w:val="28"/>
-        </w:rPr>
-      </w:pPr>
-      <w:r>
-        <w:rPr>
-          <w:rFonts w:asciiTheme="majorBidi" w:hAnsiTheme="majorBidi" w:cstheme="majorBidi"/>
-          <w:sz w:val="28"/>
-          <w:szCs w:val="28"/>
-        </w:rPr>
-        <w:t>You can create a namespace in two ways.</w:t>
-      </w:r>
-    </w:p>
-    <w:p>
-      <w:pPr>
-        <w:pStyle w:val="ListParagraph"/>
-        <w:numPr>
-          <w:ilvl w:val="0"/>
-          <w:numId w:val="6"/>
-        </w:numPr>
-        <w:ind w:left="360"/>
-        <w:jc w:val="both"/>
-        <w:rPr>
-          <w:rFonts w:asciiTheme="majorBidi" w:hAnsiTheme="majorBidi" w:cstheme="majorBidi"/>
-          <w:sz w:val="28"/>
-          <w:szCs w:val="28"/>
-        </w:rPr>
-      </w:pPr>
-      <w:r>
-        <w:rPr>
-          <w:rFonts w:asciiTheme="majorBidi" w:hAnsiTheme="majorBidi" w:cstheme="majorBidi"/>
-          <w:sz w:val="28"/>
-          <w:szCs w:val="28"/>
-        </w:rPr>
-        <w:t xml:space="preserve">Using a command → </w:t>
-      </w:r>
-      <w:proofErr w:type="spellStart"/>
-      <w:r>
-        <w:rPr>
-          <w:rFonts w:asciiTheme="majorBidi" w:hAnsiTheme="majorBidi" w:cstheme="majorBidi"/>
-          <w:b/>
-          <w:bCs/>
-          <w:i/>
-          <w:iCs/>
-          <w:sz w:val="28"/>
-          <w:szCs w:val="28"/>
-        </w:rPr>
-        <w:t>kubectl</w:t>
-      </w:r>
-      <w:proofErr w:type="spellEnd"/>
-      <w:r>
-        <w:rPr>
-          <w:rFonts w:asciiTheme="majorBidi" w:hAnsiTheme="majorBidi" w:cstheme="majorBidi"/>
-          <w:b/>
-          <w:bCs/>
-          <w:i/>
-          <w:iCs/>
-          <w:sz w:val="28"/>
-          <w:szCs w:val="28"/>
-        </w:rPr>
-        <w:t xml:space="preserve"> create namespace dev</w:t>
-      </w:r>
-    </w:p>
-    <w:p>
-      <w:pPr>
-        <w:pStyle w:val="ListParagraph"/>
-        <w:numPr>
-          <w:ilvl w:val="0"/>
-          <w:numId w:val="6"/>
-        </w:numPr>
-        <w:ind w:left="360"/>
-        <w:jc w:val="both"/>
-        <w:rPr>
-          <w:rFonts w:asciiTheme="majorBidi" w:hAnsiTheme="majorBidi" w:cstheme="majorBidi"/>
-          <w:sz w:val="28"/>
-          <w:szCs w:val="28"/>
-        </w:rPr>
-      </w:pPr>
-      <w:r>
-        <w:rPr>
-          <w:rFonts w:asciiTheme="majorBidi" w:hAnsiTheme="majorBidi" w:cstheme="majorBidi"/>
-          <w:sz w:val="28"/>
-          <w:szCs w:val="28"/>
-        </w:rPr>
-        <w:t>Using a manifest file:</w:t>
-      </w:r>
-    </w:p>
-    <w:p>
-      <w:pPr>
-        <w:jc w:val="both"/>
-        <w:rPr>
-          <w:rFonts w:asciiTheme="majorBidi" w:hAnsiTheme="majorBidi" w:cstheme="majorBidi"/>
-          <w:sz w:val="28"/>
-          <w:szCs w:val="28"/>
-        </w:rPr>
-      </w:pPr>
-    </w:p>
-    <w:p>
-      <w:pPr>
-        <w:jc w:val="both"/>
-        <w:rPr>
-          <w:rFonts w:asciiTheme="majorBidi" w:hAnsiTheme="majorBidi" w:cstheme="majorBidi"/>
-          <w:sz w:val="28"/>
-          <w:szCs w:val="28"/>
-        </w:rPr>
-      </w:pPr>
-      <w:r>
-        <w:rPr>
-          <w:rFonts w:asciiTheme="majorBidi" w:hAnsiTheme="majorBidi" w:cstheme="majorBidi"/>
-          <w:noProof/>
-          <w:sz w:val="28"/>
-          <w:szCs w:val="28"/>
-        </w:rPr>
-        <mc:AlternateContent>
-          <mc:Choice Requires="wps">
-            <w:drawing>
-              <wp:anchor distT="0" distB="0" distL="114300" distR="114300" simplePos="0" relativeHeight="251659264" behindDoc="0" locked="0" layoutInCell="1" allowOverlap="1" wp14:anchorId="7EB8A059" wp14:editId="7F28D126">
-                <wp:simplePos x="0" y="0"/>
-                <wp:positionH relativeFrom="margin">
-                  <wp:posOffset>243840</wp:posOffset>
-                </wp:positionH>
-                <wp:positionV relativeFrom="paragraph">
-                  <wp:posOffset>7620</wp:posOffset>
-                </wp:positionV>
-                <wp:extent cx="1775460" cy="1005840"/>
-                <wp:effectExtent l="0" t="0" r="15240" b="22860"/>
-                <wp:wrapNone/>
-                <wp:docPr id="1388763638" name="Rectangle 1"/>
-                <wp:cNvGraphicFramePr/>
-                <a:graphic xmlns:a="http://schemas.openxmlformats.org/drawingml/2006/main">
-                  <a:graphicData uri="http://schemas.microsoft.com/office/word/2010/wordprocessingShape">
-                    <wps:wsp>
-                      <wps:cNvSpPr/>
-                      <wps:spPr>
-                        <a:xfrm>
-                          <a:off x="0" y="0"/>
-                          <a:ext cx="1775460" cy="1005840"/>
-                        </a:xfrm>
-                        <a:prstGeom prst="rect">
-                          <a:avLst/>
-                        </a:prstGeom>
-                      </wps:spPr>
-                      <wps:style>
-                        <a:lnRef idx="2">
-                          <a:schemeClr val="dk1">
-                            <a:shade val="15000"/>
-                          </a:schemeClr>
-                        </a:lnRef>
-                        <a:fillRef idx="1">
-                          <a:schemeClr val="dk1"/>
-                        </a:fillRef>
-                        <a:effectRef idx="0">
-                          <a:schemeClr val="dk1"/>
-                        </a:effectRef>
-                        <a:fontRef idx="minor">
-                          <a:schemeClr val="lt1"/>
-                        </a:fontRef>
-                      </wps:style>
-                      <wps:txbx>
-                        <w:txbxContent>
-                          <w:p>
-                            <w:pPr>
-                              <w:spacing w:after="0"/>
-                              <w:rPr>
-                                <w:rFonts w:asciiTheme="majorBidi" w:hAnsiTheme="majorBidi" w:cstheme="majorBidi"/>
-                                <w:b/>
-                                <w:bCs/>
-                                <w:i/>
-                                <w:iCs/>
-                                <w:sz w:val="28"/>
-                                <w:szCs w:val="28"/>
-                              </w:rPr>
-                            </w:pPr>
-                            <w:proofErr w:type="spellStart"/>
-                            <w:r>
-                              <w:rPr>
-                                <w:rFonts w:asciiTheme="majorBidi" w:hAnsiTheme="majorBidi" w:cstheme="majorBidi"/>
-                                <w:b/>
-                                <w:bCs/>
-                                <w:i/>
-                                <w:iCs/>
-                                <w:sz w:val="28"/>
-                                <w:szCs w:val="28"/>
-                              </w:rPr>
-                              <w:t>apiVersion</w:t>
-                            </w:r>
-                            <w:proofErr w:type="spellEnd"/>
-                            <w:r>
-                              <w:rPr>
-                                <w:rFonts w:asciiTheme="majorBidi" w:hAnsiTheme="majorBidi" w:cstheme="majorBidi"/>
-                                <w:b/>
-                                <w:bCs/>
-                                <w:i/>
-                                <w:iCs/>
-                                <w:sz w:val="28"/>
-                                <w:szCs w:val="28"/>
-                              </w:rPr>
-                              <w:t>: v1</w:t>
-                            </w:r>
-                          </w:p>
-                          <w:p>
-                            <w:pPr>
-                              <w:spacing w:after="0"/>
-                              <w:rPr>
-                                <w:rFonts w:asciiTheme="majorBidi" w:hAnsiTheme="majorBidi" w:cstheme="majorBidi"/>
-                                <w:b/>
-                                <w:bCs/>
-                                <w:i/>
-                                <w:iCs/>
-                                <w:sz w:val="28"/>
-                                <w:szCs w:val="28"/>
-                              </w:rPr>
-                            </w:pPr>
-                            <w:r>
-                              <w:rPr>
-                                <w:rFonts w:asciiTheme="majorBidi" w:hAnsiTheme="majorBidi" w:cstheme="majorBidi"/>
-                                <w:b/>
-                                <w:bCs/>
-                                <w:i/>
-                                <w:iCs/>
-                                <w:sz w:val="28"/>
-                                <w:szCs w:val="28"/>
-                              </w:rPr>
-                              <w:t>kind: Namespace</w:t>
-                            </w:r>
-                          </w:p>
-                          <w:p>
-                            <w:pPr>
-                              <w:spacing w:after="0"/>
-                              <w:rPr>
-                                <w:rFonts w:asciiTheme="majorBidi" w:hAnsiTheme="majorBidi" w:cstheme="majorBidi"/>
-                                <w:b/>
-                                <w:bCs/>
-                                <w:i/>
-                                <w:iCs/>
-                                <w:sz w:val="28"/>
-                                <w:szCs w:val="28"/>
-                              </w:rPr>
-                            </w:pPr>
-                            <w:r>
-                              <w:rPr>
-                                <w:rFonts w:asciiTheme="majorBidi" w:hAnsiTheme="majorBidi" w:cstheme="majorBidi"/>
-                                <w:b/>
-                                <w:bCs/>
-                                <w:i/>
-                                <w:iCs/>
-                                <w:sz w:val="28"/>
-                                <w:szCs w:val="28"/>
-                              </w:rPr>
-                              <w:t>metadata:</w:t>
-                            </w:r>
-                          </w:p>
-                          <w:p>
-                            <w:pPr>
-                              <w:spacing w:after="0"/>
-                              <w:rPr>
-                                <w:rFonts w:asciiTheme="majorBidi" w:hAnsiTheme="majorBidi" w:cstheme="majorBidi"/>
-                                <w:b/>
-                                <w:bCs/>
-                                <w:i/>
-                                <w:iCs/>
-                                <w:sz w:val="28"/>
-                                <w:szCs w:val="28"/>
-                              </w:rPr>
-                            </w:pPr>
-                            <w:r>
-                              <w:rPr>
-                                <w:rFonts w:asciiTheme="majorBidi" w:hAnsiTheme="majorBidi" w:cstheme="majorBidi"/>
-                                <w:b/>
-                                <w:bCs/>
-                                <w:i/>
-                                <w:iCs/>
-                                <w:sz w:val="28"/>
-                                <w:szCs w:val="28"/>
-                              </w:rPr>
-                              <w:t xml:space="preserve">     </w:t>
-                            </w:r>
-                            <w:r>
-                              <w:rPr>
-                                <w:rFonts w:asciiTheme="majorBidi" w:hAnsiTheme="majorBidi" w:cstheme="majorBidi"/>
-                                <w:b/>
-                                <w:bCs/>
-                                <w:i/>
-                                <w:iCs/>
-                                <w:sz w:val="28"/>
-                                <w:szCs w:val="28"/>
-                              </w:rPr>
-                              <w:t>name: dev</w:t>
-                            </w:r>
-                          </w:p>
-                          <w:p>
-                            <w:pPr>
-                              <w:spacing w:after="0"/>
-                              <w:jc w:val="center"/>
-                              <w:rPr>
-                                <w:b/>
-                                <w:bCs/>
-                                <w:i/>
-                                <w:iCs/>
-                              </w:rPr>
-                            </w:pPr>
-                          </w:p>
-                        </w:txbxContent>
-                      </wps:txbx>
-                      <wps:bodyPr rot="0" spcFirstLastPara="0" vertOverflow="overflow" horzOverflow="overflow" vert="horz" wrap="square" lIns="91440" tIns="45720" rIns="91440" bIns="45720" numCol="1" spcCol="0" rtlCol="0" fromWordArt="0" anchor="ctr" anchorCtr="0" forceAA="0" compatLnSpc="1">
-                        <a:prstTxWarp prst="textNoShape">
-                          <a:avLst/>
-                        </a:prstTxWarp>
-                        <a:noAutofit/>
-                      </wps:bodyPr>
-                    </wps:wsp>
-                  </a:graphicData>
-                </a:graphic>
-                <wp14:sizeRelH relativeFrom="margin">
-                  <wp14:pctWidth>0</wp14:pctWidth>
-                </wp14:sizeRelH>
-                <wp14:sizeRelV relativeFrom="margin">
-                  <wp14:pctHeight>0</wp14:pctHeight>
-                </wp14:sizeRelV>
-              </wp:anchor>
-            </w:drawing>
-          </mc:Choice>
-          <mc:Fallback>
-            <w:pict>
-              <v:rect w14:anchorId="7EB8A059" id="Rectangle 1" o:spid="_x0000_s1026" style="position:absolute;left:0;text-align:left;margin-left:19.2pt;margin-top:.6pt;width:139.8pt;height:79.2pt;z-index:251659264;visibility:visible;mso-wrap-style:square;mso-width-percent:0;mso-height-percent:0;mso-wrap-distance-left:9pt;mso-wrap-distance-top:0;mso-wrap-distance-right:9pt;mso-wrap-distance-bottom:0;mso-position-horizontal:absolute;mso-position-horizontal-relative:margin;mso-position-vertical:absolute;mso-position-vertical-relative:text;mso-width-percent:0;mso-height-percent:0;mso-width-relative:margin;mso-height-relative:margin;v-text-anchor:middle" o:gfxdata="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" fillcolor="black [3200]" strokecolor="black [480]" strokeweight="1pt">
-                <v:textbox>
-                  <w:txbxContent>
-                    <w:p>
-                      <w:pPr>
-                        <w:spacing w:after="0"/>
-                        <w:rPr>
-                          <w:rFonts w:asciiTheme="majorBidi" w:hAnsiTheme="majorBidi" w:cstheme="majorBidi"/>
-                          <w:b/>
-                          <w:bCs/>
-                          <w:i/>
-                          <w:iCs/>
-                          <w:sz w:val="28"/>
-                          <w:szCs w:val="28"/>
-                        </w:rPr>
-                      </w:pPr>
-                      <w:proofErr w:type="spellStart"/>
-                      <w:r>
-                        <w:rPr>
-                          <w:rFonts w:asciiTheme="majorBidi" w:hAnsiTheme="majorBidi" w:cstheme="majorBidi"/>
-                          <w:b/>
-                          <w:bCs/>
-                          <w:i/>
-                          <w:iCs/>
-                          <w:sz w:val="28"/>
-                          <w:szCs w:val="28"/>
-                        </w:rPr>
-                        <w:t>apiVersion</w:t>
-                      </w:r>
-                      <w:proofErr w:type="spellEnd"/>
-                      <w:r>
-                        <w:rPr>
-                          <w:rFonts w:asciiTheme="majorBidi" w:hAnsiTheme="majorBidi" w:cstheme="majorBidi"/>
-                          <w:b/>
-                          <w:bCs/>
-                          <w:i/>
-                          <w:iCs/>
-                          <w:sz w:val="28"/>
-                          <w:szCs w:val="28"/>
-                        </w:rPr>
-                        <w:t>: v1</w:t>
-                      </w:r>
-                    </w:p>
-                    <w:p>
-                      <w:pPr>
-                        <w:spacing w:after="0"/>
-                        <w:rPr>
-                          <w:rFonts w:asciiTheme="majorBidi" w:hAnsiTheme="majorBidi" w:cstheme="majorBidi"/>
-                          <w:b/>
-                          <w:bCs/>
-                          <w:i/>
-                          <w:iCs/>
-                          <w:sz w:val="28"/>
-                          <w:szCs w:val="28"/>
-                        </w:rPr>
-                      </w:pPr>
-                      <w:r>
-                        <w:rPr>
-                          <w:rFonts w:asciiTheme="majorBidi" w:hAnsiTheme="majorBidi" w:cstheme="majorBidi"/>
-                          <w:b/>
-                          <w:bCs/>
-                          <w:i/>
-                          <w:iCs/>
-                          <w:sz w:val="28"/>
-                          <w:szCs w:val="28"/>
-                        </w:rPr>
-                        <w:t>kind: Namespace</w:t>
-                      </w:r>
-                    </w:p>
-                    <w:p>
-                      <w:pPr>
-                        <w:spacing w:after="0"/>
-                        <w:rPr>
-                          <w:rFonts w:asciiTheme="majorBidi" w:hAnsiTheme="majorBidi" w:cstheme="majorBidi"/>
-                          <w:b/>
-                          <w:bCs/>
-                          <w:i/>
-                          <w:iCs/>
-                          <w:sz w:val="28"/>
-                          <w:szCs w:val="28"/>
-                        </w:rPr>
-                      </w:pPr>
-                      <w:r>
-                        <w:rPr>
-                          <w:rFonts w:asciiTheme="majorBidi" w:hAnsiTheme="majorBidi" w:cstheme="majorBidi"/>
-                          <w:b/>
-                          <w:bCs/>
-                          <w:i/>
-                          <w:iCs/>
-                          <w:sz w:val="28"/>
-                          <w:szCs w:val="28"/>
-                        </w:rPr>
-                        <w:t>metadata:</w:t>
-                      </w:r>
-                    </w:p>
-                    <w:p>
-                      <w:pPr>
-                        <w:spacing w:after="0"/>
-                        <w:rPr>
-                          <w:rFonts w:asciiTheme="majorBidi" w:hAnsiTheme="majorBidi" w:cstheme="majorBidi"/>
-                          <w:b/>
-                          <w:bCs/>
-                          <w:i/>
-                          <w:iCs/>
-                          <w:sz w:val="28"/>
-                          <w:szCs w:val="28"/>
-                        </w:rPr>
-                      </w:pPr>
-                      <w:r>
-                        <w:rPr>
-                          <w:rFonts w:asciiTheme="majorBidi" w:hAnsiTheme="majorBidi" w:cstheme="majorBidi"/>
-                          <w:b/>
-                          <w:bCs/>
-                          <w:i/>
-                          <w:iCs/>
-                          <w:sz w:val="28"/>
-                          <w:szCs w:val="28"/>
-                        </w:rPr>
-                        <w:t xml:space="preserve">     </w:t>
-                      </w:r>
-                      <w:r>
-                        <w:rPr>
-                          <w:rFonts w:asciiTheme="majorBidi" w:hAnsiTheme="majorBidi" w:cstheme="majorBidi"/>
-                          <w:b/>
-                          <w:bCs/>
-                          <w:i/>
-                          <w:iCs/>
-                          <w:sz w:val="28"/>
-                          <w:szCs w:val="28"/>
-                        </w:rPr>
-                        <w:t>name: dev</w:t>
-                      </w:r>
-                    </w:p>
-                    <w:p>
-                      <w:pPr>
-                        <w:spacing w:after="0"/>
-                        <w:jc w:val="center"/>
-                        <w:rPr>
-                          <w:b/>
-                          <w:bCs/>
-                          <w:i/>
-                          <w:iCs/>
-                        </w:rPr>
-                      </w:pPr>
-                    </w:p>
-                  </w:txbxContent>
-                </v:textbox>
-                <w10:wrap anchorx="margin"/>
-              </v:rect>
-            </w:pict>
-          </mc:Fallback>
-        </mc:AlternateContent>
-      </w:r>
-    </w:p>
-    <w:p>
-      <w:pPr>
-        <w:jc w:val="both"/>
-        <w:rPr>
-          <w:rFonts w:asciiTheme="majorBidi" w:hAnsiTheme="majorBidi" w:cstheme="majorBidi"/>
-          <w:sz w:val="32"/>
-          <w:szCs w:val="32"/>
-        </w:rPr>
-      </w:pPr>
-    </w:p>
-    <w:p>
-      <w:pPr>
-        <w:jc w:val="both"/>
-        <w:rPr>
-          <w:rFonts w:asciiTheme="majorBidi" w:hAnsiTheme="majorBidi" w:cstheme="majorBidi"/>
-          <w:sz w:val="32"/>
-          <w:szCs w:val="32"/>
-        </w:rPr>
-      </w:pPr>
-    </w:p>
-    <w:p>
-      <w:pPr>
-        <w:ind w:left="360"/>
-        <w:jc w:val="both"/>
-        <w:rPr>
-          <w:rFonts w:asciiTheme="majorBidi" w:hAnsiTheme="majorBidi" w:cstheme="majorBidi"/>
-          <w:b/>
-          <w:bCs/>
-          <w:i/>
-          <w:iCs/>
-          <w:sz w:val="28"/>
-          <w:szCs w:val="28"/>
-        </w:rPr>
-      </w:pPr>
-      <w:r>
-        <w:rPr>
-          <w:rFonts w:asciiTheme="majorBidi" w:hAnsiTheme="majorBidi" w:cstheme="majorBidi"/>
-          <w:sz w:val="28"/>
-          <w:szCs w:val="28"/>
-        </w:rPr>
-        <w:t>Apply it with</w:t>
-      </w:r>
-      <w:r>
-        <w:rPr>
-          <w:rFonts w:asciiTheme="majorBidi" w:hAnsiTheme="majorBidi" w:cstheme="majorBidi"/>
-          <w:sz w:val="28"/>
-          <w:szCs w:val="28"/>
-        </w:rPr>
-        <w:t xml:space="preserve"> </w:t>
-      </w:r>
-      <w:r>
-        <w:rPr>
-          <w:rFonts w:asciiTheme="majorBidi" w:hAnsiTheme="majorBidi" w:cstheme="majorBidi"/>
-          <w:sz w:val="28"/>
-          <w:szCs w:val="28"/>
-        </w:rPr>
-        <w:t>→</w:t>
-      </w:r>
-      <w:r>
-        <w:rPr>
-          <w:rFonts w:asciiTheme="majorBidi" w:hAnsiTheme="majorBidi" w:cstheme="majorBidi"/>
-          <w:b/>
-          <w:bCs/>
-          <w:i/>
-          <w:iCs/>
-          <w:sz w:val="28"/>
-          <w:szCs w:val="28"/>
-        </w:rPr>
-        <w:t xml:space="preserve"> </w:t>
-      </w:r>
-      <w:proofErr w:type="spellStart"/>
-      <w:r>
-        <w:rPr>
-          <w:rFonts w:asciiTheme="majorBidi" w:hAnsiTheme="majorBidi" w:cstheme="majorBidi"/>
-          <w:b/>
-          <w:bCs/>
-          <w:i/>
-          <w:iCs/>
-          <w:sz w:val="28"/>
-          <w:szCs w:val="28"/>
-        </w:rPr>
-        <w:t>kubectl</w:t>
-      </w:r>
-      <w:proofErr w:type="spellEnd"/>
-      <w:r>
-        <w:rPr>
-          <w:rFonts w:asciiTheme="majorBidi" w:hAnsiTheme="majorBidi" w:cstheme="majorBidi"/>
-          <w:b/>
-          <w:bCs/>
-          <w:i/>
-          <w:iCs/>
-          <w:sz w:val="28"/>
-          <w:szCs w:val="28"/>
-        </w:rPr>
-        <w:t xml:space="preserve"> apply -f </w:t>
-      </w:r>
-      <w:proofErr w:type="spellStart"/>
-      <w:proofErr w:type="gramStart"/>
-      <w:r>
-        <w:rPr>
-          <w:rFonts w:asciiTheme="majorBidi" w:hAnsiTheme="majorBidi" w:cstheme="majorBidi"/>
-          <w:b/>
-          <w:bCs/>
-          <w:i/>
-          <w:iCs/>
-          <w:sz w:val="28"/>
-          <w:szCs w:val="28"/>
-        </w:rPr>
-        <w:t>namespace.yaml</w:t>
-      </w:r>
-      <w:proofErr w:type="spellEnd"/>
-      <w:proofErr w:type="gramEnd"/>
-    </w:p>
-    <w:p>
-      <w:pPr>
-        <w:spacing w:after="120"/>
-        <w:jc w:val="both"/>
-        <w:rPr>
-          <w:rFonts w:asciiTheme="majorBidi" w:hAnsiTheme="majorBidi" w:cstheme="majorBidi"/>
-          <w:sz w:val="28"/>
-          <w:szCs w:val="28"/>
-        </w:rPr>
-      </w:pPr>
-      <w:r>
-        <w:rPr>
-          <w:rFonts w:asciiTheme="majorBidi" w:hAnsiTheme="majorBidi" w:cstheme="majorBidi"/>
-          <w:sz w:val="28"/>
-          <w:szCs w:val="28"/>
-        </w:rPr>
-        <w:t xml:space="preserve">For </w:t>
-      </w:r>
-      <w:r>
-        <w:rPr>
-          <w:rFonts w:asciiTheme="majorBidi" w:hAnsiTheme="majorBidi" w:cstheme="majorBidi"/>
-          <w:b/>
-          <w:bCs/>
-          <w:sz w:val="28"/>
-          <w:szCs w:val="28"/>
-        </w:rPr>
-        <w:t>Deleting</w:t>
-      </w:r>
-      <w:r>
-        <w:rPr>
-          <w:rFonts w:asciiTheme="majorBidi" w:hAnsiTheme="majorBidi" w:cstheme="majorBidi"/>
-          <w:sz w:val="28"/>
-          <w:szCs w:val="28"/>
-        </w:rPr>
-        <w:t xml:space="preserve"> a Namespace</w:t>
-      </w:r>
-      <w:r>
-        <w:rPr>
-          <w:rFonts w:asciiTheme="majorBidi" w:hAnsiTheme="majorBidi" w:cstheme="majorBidi"/>
-          <w:sz w:val="28"/>
-          <w:szCs w:val="28"/>
-        </w:rPr>
-        <w:t xml:space="preserve"> </w:t>
-      </w:r>
-      <w:r>
-        <w:rPr>
-          <w:rFonts w:asciiTheme="majorBidi" w:hAnsiTheme="majorBidi" w:cstheme="majorBidi"/>
-          <w:sz w:val="28"/>
-          <w:szCs w:val="28"/>
-        </w:rPr>
-        <w:t>→</w:t>
-      </w:r>
-      <w:r>
-        <w:rPr>
-          <w:rFonts w:asciiTheme="majorBidi" w:hAnsiTheme="majorBidi" w:cstheme="majorBidi"/>
-          <w:b/>
-          <w:bCs/>
-          <w:i/>
-          <w:iCs/>
-          <w:sz w:val="28"/>
-          <w:szCs w:val="28"/>
-        </w:rPr>
-        <w:t xml:space="preserve"> </w:t>
-      </w:r>
-      <w:proofErr w:type="spellStart"/>
-      <w:r>
-        <w:rPr>
-          <w:rFonts w:asciiTheme="majorBidi" w:hAnsiTheme="majorBidi" w:cstheme="majorBidi"/>
-          <w:b/>
-          <w:bCs/>
-          <w:i/>
-          <w:iCs/>
-          <w:sz w:val="28"/>
-          <w:szCs w:val="28"/>
-        </w:rPr>
-        <w:t>kubectl</w:t>
-      </w:r>
-      <w:proofErr w:type="spellEnd"/>
-      <w:r>
-        <w:rPr>
-          <w:rFonts w:asciiTheme="majorBidi" w:hAnsiTheme="majorBidi" w:cstheme="majorBidi"/>
-          <w:b/>
-          <w:bCs/>
-          <w:i/>
-          <w:iCs/>
-          <w:sz w:val="28"/>
-          <w:szCs w:val="28"/>
-        </w:rPr>
-        <w:t xml:space="preserve"> delete namespace dev</w:t>
-      </w:r>
-      <w:r>
-        <w:rPr>
-          <w:rFonts w:asciiTheme="majorBidi" w:hAnsiTheme="majorBidi" w:cstheme="majorBidi"/>
-          <w:sz w:val="28"/>
-          <w:szCs w:val="28"/>
-        </w:rPr>
-        <w:t xml:space="preserve"> </w:t>
-      </w:r>
-      <w:r>
-        <w:rPr>
-          <w:rFonts w:asciiTheme="majorBidi" w:hAnsiTheme="majorBidi" w:cstheme="majorBidi"/>
-          <w:sz w:val="28"/>
-          <w:szCs w:val="28"/>
-        </w:rPr>
-        <w:t>→</w:t>
-      </w:r>
-      <w:r>
-        <w:rPr>
-          <w:rFonts w:asciiTheme="majorBidi" w:hAnsiTheme="majorBidi" w:cstheme="majorBidi"/>
-          <w:sz w:val="28"/>
-          <w:szCs w:val="28"/>
-        </w:rPr>
-        <w:t xml:space="preserve"> </w:t>
-      </w:r>
-      <w:r>
-        <w:rPr>
-          <w:rFonts w:asciiTheme="majorBidi" w:hAnsiTheme="majorBidi" w:cstheme="majorBidi"/>
-          <w:sz w:val="28"/>
-          <w:szCs w:val="28"/>
-        </w:rPr>
-        <w:t>Deleting a namespace removes all resources inside it.</w:t>
-      </w:r>
-    </w:p>
-    <w:p>
-      <w:pPr>
-        <w:spacing w:after="80"/>
-        <w:jc w:val="both"/>
-        <w:rPr>
-          <w:rFonts w:asciiTheme="majorBidi" w:hAnsiTheme="majorBidi" w:cstheme="majorBidi"/>
-          <w:b/>
-          <w:bCs/>
-          <w:sz w:val="32"/>
-          <w:szCs w:val="32"/>
-        </w:rPr>
-      </w:pPr>
-      <w:r>
-        <w:rPr>
-          <w:rFonts w:asciiTheme="majorBidi" w:hAnsiTheme="majorBidi" w:cstheme="majorBidi"/>
-          <w:b/>
-          <w:bCs/>
-          <w:sz w:val="32"/>
-          <w:szCs w:val="32"/>
-        </w:rPr>
-        <w:t>Viewing Namespaces</w:t>
-      </w:r>
-      <w:r>
-        <w:rPr>
-          <w:rFonts w:asciiTheme="majorBidi" w:hAnsiTheme="majorBidi" w:cstheme="majorBidi"/>
-          <w:b/>
-          <w:bCs/>
-          <w:sz w:val="32"/>
-          <w:szCs w:val="32"/>
-        </w:rPr>
-        <w:t>:</w:t>
-      </w:r>
-    </w:p>
-    <w:p>
-      <w:pPr>
-        <w:pStyle w:val="ListParagraph"/>
-        <w:numPr>
-          <w:ilvl w:val="0"/>
-          <w:numId w:val="7"/>
-        </w:numPr>
-        <w:ind w:left="360"/>
-        <w:jc w:val="both"/>
-        <w:rPr>
-          <w:rFonts w:asciiTheme="majorBidi" w:hAnsiTheme="majorBidi" w:cstheme="majorBidi"/>
-          <w:sz w:val="28"/>
-          <w:szCs w:val="28"/>
-        </w:rPr>
-      </w:pPr>
-      <w:r>
-        <w:rPr>
-          <w:rFonts w:asciiTheme="majorBidi" w:hAnsiTheme="majorBidi" w:cstheme="majorBidi"/>
-          <w:sz w:val="28"/>
-          <w:szCs w:val="28"/>
-        </w:rPr>
-        <w:t xml:space="preserve">To list all namespaces in the cluster → </w:t>
-      </w:r>
-      <w:proofErr w:type="spellStart"/>
-      <w:r>
-        <w:rPr>
-          <w:rFonts w:asciiTheme="majorBidi" w:hAnsiTheme="majorBidi" w:cstheme="majorBidi"/>
-          <w:b/>
-          <w:bCs/>
-          <w:i/>
-          <w:iCs/>
-          <w:sz w:val="28"/>
-          <w:szCs w:val="28"/>
-        </w:rPr>
-        <w:t>kubectl</w:t>
-      </w:r>
-      <w:proofErr w:type="spellEnd"/>
-      <w:r>
-        <w:rPr>
-          <w:rFonts w:asciiTheme="majorBidi" w:hAnsiTheme="majorBidi" w:cstheme="majorBidi"/>
-          <w:b/>
-          <w:bCs/>
-          <w:i/>
-          <w:iCs/>
-          <w:sz w:val="28"/>
-          <w:szCs w:val="28"/>
-        </w:rPr>
-        <w:t xml:space="preserve"> get namespaces</w:t>
-      </w:r>
-      <w:r>
-        <w:rPr>
-          <w:rFonts w:asciiTheme="majorBidi" w:hAnsiTheme="majorBidi" w:cstheme="majorBidi"/>
-          <w:sz w:val="28"/>
-          <w:szCs w:val="28"/>
-        </w:rPr>
-        <w:t xml:space="preserve"> or </w:t>
-      </w:r>
-      <w:proofErr w:type="spellStart"/>
-      <w:r>
-        <w:rPr>
-          <w:rFonts w:asciiTheme="majorBidi" w:hAnsiTheme="majorBidi" w:cstheme="majorBidi"/>
-          <w:b/>
-          <w:bCs/>
-          <w:i/>
-          <w:iCs/>
-          <w:sz w:val="28"/>
-          <w:szCs w:val="28"/>
-        </w:rPr>
-        <w:t>kubectl</w:t>
-      </w:r>
-      <w:proofErr w:type="spellEnd"/>
-      <w:r>
-        <w:rPr>
-          <w:rFonts w:asciiTheme="majorBidi" w:hAnsiTheme="majorBidi" w:cstheme="majorBidi"/>
-          <w:b/>
-          <w:bCs/>
-          <w:i/>
-          <w:iCs/>
-          <w:sz w:val="28"/>
-          <w:szCs w:val="28"/>
-        </w:rPr>
-        <w:t xml:space="preserve"> get ns</w:t>
-      </w:r>
-    </w:p>
-    <w:p>
-      <w:pPr>
-        <w:pStyle w:val="ListParagraph"/>
-        <w:numPr>
-          <w:ilvl w:val="0"/>
-          <w:numId w:val="7"/>
-        </w:numPr>
-        <w:ind w:left="360"/>
-        <w:jc w:val="both"/>
-        <w:rPr>
-          <w:rFonts w:asciiTheme="majorBidi" w:hAnsiTheme="majorBidi" w:cstheme="majorBidi"/>
-          <w:sz w:val="28"/>
-          <w:szCs w:val="28"/>
-        </w:rPr>
-      </w:pPr>
-      <w:r>
-        <w:rPr>
-          <w:rFonts w:asciiTheme="majorBidi" w:hAnsiTheme="majorBidi" w:cstheme="majorBidi"/>
-          <w:sz w:val="28"/>
-          <w:szCs w:val="28"/>
-        </w:rPr>
-        <w:t xml:space="preserve">To see resources inside a specific namespace, use the </w:t>
-      </w:r>
-      <w:r>
-        <w:rPr>
-          <w:rFonts w:asciiTheme="majorBidi" w:hAnsiTheme="majorBidi" w:cstheme="majorBidi"/>
-          <w:b/>
-          <w:bCs/>
-          <w:i/>
-          <w:iCs/>
-          <w:sz w:val="28"/>
-          <w:szCs w:val="28"/>
-        </w:rPr>
-        <w:t>-n</w:t>
-      </w:r>
-      <w:r>
-        <w:rPr>
-          <w:rFonts w:asciiTheme="majorBidi" w:hAnsiTheme="majorBidi" w:cstheme="majorBidi"/>
-          <w:sz w:val="28"/>
-          <w:szCs w:val="28"/>
-        </w:rPr>
-        <w:t xml:space="preserve"> or </w:t>
-      </w:r>
-      <w:r>
-        <w:rPr>
-          <w:rFonts w:asciiTheme="majorBidi" w:hAnsiTheme="majorBidi" w:cstheme="majorBidi"/>
-          <w:b/>
-          <w:bCs/>
-          <w:i/>
-          <w:iCs/>
-          <w:sz w:val="28"/>
-          <w:szCs w:val="28"/>
-        </w:rPr>
-        <w:t xml:space="preserve">--namespace </w:t>
-      </w:r>
-      <w:r>
-        <w:rPr>
-          <w:rFonts w:asciiTheme="majorBidi" w:hAnsiTheme="majorBidi" w:cstheme="majorBidi"/>
-          <w:sz w:val="28"/>
-          <w:szCs w:val="28"/>
-        </w:rPr>
-        <w:t>flag. Example:</w:t>
-      </w:r>
-      <w:r>
-        <w:rPr>
-          <w:rFonts w:asciiTheme="majorBidi" w:hAnsiTheme="majorBidi" w:cstheme="majorBidi"/>
-          <w:sz w:val="28"/>
-          <w:szCs w:val="28"/>
-        </w:rPr>
-        <w:t xml:space="preserve"> </w:t>
-      </w:r>
-      <w:proofErr w:type="spellStart"/>
-      <w:r>
-        <w:rPr>
-          <w:rFonts w:asciiTheme="majorBidi" w:hAnsiTheme="majorBidi" w:cstheme="majorBidi"/>
-          <w:b/>
-          <w:bCs/>
-          <w:i/>
-          <w:iCs/>
-          <w:sz w:val="28"/>
-          <w:szCs w:val="28"/>
-        </w:rPr>
-        <w:t>kubectl</w:t>
-      </w:r>
-      <w:proofErr w:type="spellEnd"/>
-      <w:r>
-        <w:rPr>
-          <w:rFonts w:asciiTheme="majorBidi" w:hAnsiTheme="majorBidi" w:cstheme="majorBidi"/>
-          <w:b/>
-          <w:bCs/>
-          <w:i/>
-          <w:iCs/>
-          <w:sz w:val="28"/>
-          <w:szCs w:val="28"/>
-        </w:rPr>
-        <w:t xml:space="preserve"> get pods -n dev</w:t>
-      </w:r>
-    </w:p>
-    <w:p>
-      <w:pPr>
-        <w:pStyle w:val="ListParagraph"/>
-        <w:numPr>
-          <w:ilvl w:val="0"/>
-          <w:numId w:val="8"/>
-        </w:numPr>
-        <w:spacing w:after="120"/>
-        <w:ind w:left="360"/>
-        <w:jc w:val="both"/>
-        <w:rPr>
-          <w:rFonts w:asciiTheme="majorBidi" w:hAnsiTheme="majorBidi" w:cstheme="majorBidi"/>
-          <w:sz w:val="28"/>
-          <w:szCs w:val="28"/>
-        </w:rPr>
-      </w:pPr>
-      <w:r>
-        <w:rPr>
-          <w:rFonts w:asciiTheme="majorBidi" w:hAnsiTheme="majorBidi" w:cstheme="majorBidi"/>
-          <w:sz w:val="28"/>
-          <w:szCs w:val="28"/>
-        </w:rPr>
-        <w:t xml:space="preserve">For Viewing All Resources in a Namespace → </w:t>
-      </w:r>
-      <w:proofErr w:type="spellStart"/>
-      <w:r>
-        <w:rPr>
-          <w:rFonts w:asciiTheme="majorBidi" w:hAnsiTheme="majorBidi" w:cstheme="majorBidi"/>
-          <w:b/>
-          <w:bCs/>
-          <w:i/>
-          <w:iCs/>
-          <w:sz w:val="28"/>
-          <w:szCs w:val="28"/>
-        </w:rPr>
-        <w:t>kubectl</w:t>
-      </w:r>
-      <w:proofErr w:type="spellEnd"/>
-      <w:r>
-        <w:rPr>
-          <w:rFonts w:asciiTheme="majorBidi" w:hAnsiTheme="majorBidi" w:cstheme="majorBidi"/>
-          <w:b/>
-          <w:bCs/>
-          <w:i/>
-          <w:iCs/>
-          <w:sz w:val="28"/>
-          <w:szCs w:val="28"/>
-        </w:rPr>
-        <w:t xml:space="preserve"> get all -n dev</w:t>
-      </w:r>
-    </w:p>
-    <w:p>
-      <w:pPr>
-        <w:spacing w:after="80"/>
-        <w:jc w:val="both"/>
-        <w:rPr>
-          <w:rFonts w:asciiTheme="majorBidi" w:hAnsiTheme="majorBidi" w:cstheme="majorBidi"/>
-          <w:b/>
-          <w:bCs/>
-          <w:sz w:val="32"/>
-          <w:szCs w:val="32"/>
-        </w:rPr>
-      </w:pPr>
-      <w:r>
-        <w:rPr>
-          <w:rFonts w:asciiTheme="majorBidi" w:hAnsiTheme="majorBidi" w:cstheme="majorBidi"/>
-          <w:b/>
-          <w:bCs/>
-          <w:sz w:val="32"/>
-          <w:szCs w:val="32"/>
-        </w:rPr>
-        <w:t>Creating Resources in a Namespace</w:t>
-      </w:r>
-      <w:r>
-        <w:rPr>
-          <w:rFonts w:asciiTheme="majorBidi" w:hAnsiTheme="majorBidi" w:cstheme="majorBidi"/>
-          <w:b/>
-          <w:bCs/>
-          <w:sz w:val="32"/>
-          <w:szCs w:val="32"/>
-        </w:rPr>
-        <w:t>:</w:t>
-      </w:r>
-    </w:p>
-    <w:p>
-      <w:pPr>
-        <w:spacing w:after="80"/>
-        <w:jc w:val="both"/>
-        <w:rPr>
-          <w:rFonts w:asciiTheme="majorBidi" w:hAnsiTheme="majorBidi" w:cstheme="majorBidi"/>
-          <w:sz w:val="28"/>
-          <w:szCs w:val="28"/>
-        </w:rPr>
-      </w:pPr>
-      <w:r>
-        <w:rPr>
-          <w:rFonts w:asciiTheme="majorBidi" w:hAnsiTheme="majorBidi" w:cstheme="majorBidi"/>
-          <w:sz w:val="28"/>
-          <w:szCs w:val="28"/>
-        </w:rPr>
-        <w:t>You can specify the namespace when creating resources.</w:t>
-      </w:r>
-    </w:p>
-    <w:p>
-      <w:pPr>
-        <w:pStyle w:val="ListParagraph"/>
-        <w:numPr>
-          <w:ilvl w:val="0"/>
-          <w:numId w:val="8"/>
-        </w:numPr>
-        <w:ind w:left="360"/>
-        <w:jc w:val="both"/>
-        <w:rPr>
-          <w:rFonts w:asciiTheme="majorBidi" w:hAnsiTheme="majorBidi" w:cstheme="majorBidi"/>
-          <w:sz w:val="28"/>
-          <w:szCs w:val="28"/>
-        </w:rPr>
-      </w:pPr>
-      <w:r>
-        <w:rPr>
-          <w:rFonts w:asciiTheme="majorBidi" w:hAnsiTheme="majorBidi" w:cstheme="majorBidi"/>
-          <w:noProof/>
-          <w:sz w:val="28"/>
-          <w:szCs w:val="28"/>
-        </w:rPr>
-        <mc:AlternateContent>
-          <mc:Choice Requires="wps">
-            <w:drawing>
-              <wp:anchor distT="0" distB="0" distL="114300" distR="114300" simplePos="0" relativeHeight="251660288" behindDoc="0" locked="0" layoutInCell="1" allowOverlap="1" wp14:anchorId="0FF53D5E" wp14:editId="2F05BD84">
-                <wp:simplePos x="0" y="0"/>
-                <wp:positionH relativeFrom="column">
-                  <wp:posOffset>236220</wp:posOffset>
-                </wp:positionH>
-                <wp:positionV relativeFrom="paragraph">
-                  <wp:posOffset>280670</wp:posOffset>
-                </wp:positionV>
-                <wp:extent cx="1836420" cy="784860"/>
-                <wp:effectExtent l="0" t="0" r="11430" b="15240"/>
-                <wp:wrapNone/>
-                <wp:docPr id="430867786" name="Rectangle 2"/>
-                <wp:cNvGraphicFramePr/>
-                <a:graphic xmlns:a="http://schemas.openxmlformats.org/drawingml/2006/main">
-                  <a:graphicData uri="http://schemas.microsoft.com/office/word/2010/wordprocessingShape">
-                    <wps:wsp>
-                      <wps:cNvSpPr/>
-                      <wps:spPr>
-                        <a:xfrm>
-                          <a:off x="0" y="0"/>
-                          <a:ext cx="1836420" cy="784860"/>
-                        </a:xfrm>
-                        <a:prstGeom prst="rect">
-                          <a:avLst/>
-                        </a:prstGeom>
-                      </wps:spPr>
-                      <wps:style>
-                        <a:lnRef idx="2">
-                          <a:schemeClr val="dk1">
-                            <a:shade val="15000"/>
-                          </a:schemeClr>
-                        </a:lnRef>
-                        <a:fillRef idx="1">
-                          <a:schemeClr val="dk1"/>
-                        </a:fillRef>
-                        <a:effectRef idx="0">
-                          <a:schemeClr val="dk1"/>
-                        </a:effectRef>
-                        <a:fontRef idx="minor">
-                          <a:schemeClr val="lt1"/>
-                        </a:fontRef>
-                      </wps:style>
-                      <wps:txbx>
-                        <w:txbxContent>
-                          <w:p>
-                            <w:pPr>
-                              <w:spacing w:after="0"/>
-                              <w:rPr>
-                                <w:rFonts w:asciiTheme="majorBidi" w:hAnsiTheme="majorBidi" w:cstheme="majorBidi"/>
-                                <w:b/>
-                                <w:bCs/>
-                                <w:i/>
-                                <w:iCs/>
-                                <w:sz w:val="28"/>
-                                <w:szCs w:val="28"/>
-                              </w:rPr>
-                            </w:pPr>
-                            <w:r>
-                              <w:rPr>
-                                <w:rFonts w:asciiTheme="majorBidi" w:hAnsiTheme="majorBidi" w:cstheme="majorBidi"/>
-                                <w:b/>
-                                <w:bCs/>
-                                <w:i/>
-                                <w:iCs/>
-                                <w:sz w:val="28"/>
-                                <w:szCs w:val="28"/>
-                              </w:rPr>
-                              <w:t>metadata:</w:t>
-                            </w:r>
-                          </w:p>
-                          <w:p>
-                            <w:pPr>
-                              <w:spacing w:after="0"/>
-                              <w:rPr>
-                                <w:rFonts w:asciiTheme="majorBidi" w:hAnsiTheme="majorBidi" w:cstheme="majorBidi"/>
-                                <w:b/>
-                                <w:bCs/>
-                                <w:i/>
-                                <w:iCs/>
-                                <w:sz w:val="28"/>
-                                <w:szCs w:val="28"/>
-                              </w:rPr>
-                            </w:pPr>
-                            <w:r>
-                              <w:rPr>
-                                <w:rFonts w:asciiTheme="majorBidi" w:hAnsiTheme="majorBidi" w:cstheme="majorBidi"/>
-                                <w:b/>
-                                <w:bCs/>
-                                <w:i/>
-                                <w:iCs/>
-                                <w:sz w:val="28"/>
-                                <w:szCs w:val="28"/>
-                              </w:rPr>
-                              <w:t xml:space="preserve">     </w:t>
-                            </w:r>
-                            <w:r>
-                              <w:rPr>
-                                <w:rFonts w:asciiTheme="majorBidi" w:hAnsiTheme="majorBidi" w:cstheme="majorBidi"/>
-                                <w:b/>
-                                <w:bCs/>
-                                <w:i/>
-                                <w:iCs/>
-                                <w:sz w:val="28"/>
-                                <w:szCs w:val="28"/>
-                              </w:rPr>
-                              <w:t>name: my-pod</w:t>
-                            </w:r>
-                          </w:p>
-                          <w:p>
-                            <w:pPr>
-                              <w:spacing w:after="0"/>
-                              <w:rPr>
-                                <w:rFonts w:asciiTheme="majorBidi" w:hAnsiTheme="majorBidi" w:cstheme="majorBidi"/>
-                                <w:b/>
-                                <w:bCs/>
-                                <w:i/>
-                                <w:iCs/>
-                                <w:sz w:val="28"/>
-                                <w:szCs w:val="28"/>
-                              </w:rPr>
-                            </w:pPr>
-                            <w:r>
-                              <w:rPr>
-                                <w:rFonts w:asciiTheme="majorBidi" w:hAnsiTheme="majorBidi" w:cstheme="majorBidi"/>
-                                <w:b/>
-                                <w:bCs/>
-                                <w:i/>
-                                <w:iCs/>
-                                <w:sz w:val="28"/>
-                                <w:szCs w:val="28"/>
-                              </w:rPr>
-                              <w:t xml:space="preserve">     </w:t>
-                            </w:r>
-                            <w:r>
-                              <w:rPr>
-                                <w:rFonts w:asciiTheme="majorBidi" w:hAnsiTheme="majorBidi" w:cstheme="majorBidi"/>
-                                <w:b/>
-                                <w:bCs/>
-                                <w:i/>
-                                <w:iCs/>
-                                <w:sz w:val="28"/>
-                                <w:szCs w:val="28"/>
-                              </w:rPr>
-                              <w:t>namespace: dev</w:t>
-                            </w:r>
-                          </w:p>
-                          <w:p>
-                            <w:pPr>
-                              <w:spacing w:after="0"/>
-                              <w:jc w:val="center"/>
-                              <w:rPr>
-                                <w:b/>
-                                <w:bCs/>
-                                <w:i/>
-                                <w:iCs/>
-                              </w:rPr>
-                            </w:pPr>
-                          </w:p>
-                        </w:txbxContent>
-                      </wps:txbx>
-                      <wps:bodyPr rot="0" spcFirstLastPara="0" vertOverflow="overflow" horzOverflow="overflow" vert="horz" wrap="square" lIns="91440" tIns="45720" rIns="91440" bIns="45720" numCol="1" spcCol="0" rtlCol="0" fromWordArt="0" anchor="ctr" anchorCtr="0" forceAA="0" compatLnSpc="1">
-                        <a:prstTxWarp prst="textNoShape">
-                          <a:avLst/>
-                        </a:prstTxWarp>
-                        <a:noAutofit/>
-                      </wps:bodyPr>
-                    </wps:wsp>
-                  </a:graphicData>
-                </a:graphic>
-                <wp14:sizeRelH relativeFrom="margin">
-                  <wp14:pctWidth>0</wp14:pctWidth>
-                </wp14:sizeRelH>
-                <wp14:sizeRelV relativeFrom="margin">
-                  <wp14:pctHeight>0</wp14:pctHeight>
-                </wp14:sizeRelV>
-              </wp:anchor>
-            </w:drawing>
-          </mc:Choice>
-          <mc:Fallback>
-            <w:pict>
-              <v:rect w14:anchorId="0FF53D5E" id="Rectangle 2" o:spid="_x0000_s1027" style="position:absolute;left:0;text-align:left;margin-left:18.6pt;margin-top:22.1pt;width:144.6pt;height:61.8pt;z-index:251660288;visibility:visible;mso-wrap-style:square;mso-width-percent:0;mso-height-percent:0;mso-wrap-distance-left:9pt;mso-wrap-distance-top:0;mso-wrap-distance-right:9pt;mso-wrap-distance-bottom:0;mso-position-horizontal:absolute;mso-position-horizontal-relative:text;mso-position-vertical:absolute;mso-position-vertical-relative:text;mso-width-percent:0;mso-height-percent:0;mso-width-relative:margin;mso-height-relative:margin;v-text-anchor:middle" o:gfxdata="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" fillcolor="black [3200]" strokecolor="black [480]" strokeweight="1pt">
-                <v:textbox>
-                  <w:txbxContent>
-                    <w:p>
-                      <w:pPr>
-                        <w:spacing w:after="0"/>
-                        <w:rPr>
-                          <w:rFonts w:asciiTheme="majorBidi" w:hAnsiTheme="majorBidi" w:cstheme="majorBidi"/>
-                          <w:b/>
-                          <w:bCs/>
-                          <w:i/>
-                          <w:iCs/>
-                          <w:sz w:val="28"/>
-                          <w:szCs w:val="28"/>
-                        </w:rPr>
-                      </w:pPr>
-                      <w:r>
-                        <w:rPr>
-                          <w:rFonts w:asciiTheme="majorBidi" w:hAnsiTheme="majorBidi" w:cstheme="majorBidi"/>
-                          <w:b/>
-                          <w:bCs/>
-                          <w:i/>
-                          <w:iCs/>
-                          <w:sz w:val="28"/>
-                          <w:szCs w:val="28"/>
-                        </w:rPr>
-                        <w:t>metadata:</w:t>
-                      </w:r>
-                    </w:p>
-                    <w:p>
-                      <w:pPr>
-                        <w:spacing w:after="0"/>
-                        <w:rPr>
-                          <w:rFonts w:asciiTheme="majorBidi" w:hAnsiTheme="majorBidi" w:cstheme="majorBidi"/>
-                          <w:b/>
-                          <w:bCs/>
-                          <w:i/>
-                          <w:iCs/>
-                          <w:sz w:val="28"/>
-                          <w:szCs w:val="28"/>
-                        </w:rPr>
-                      </w:pPr>
-                      <w:r>
-                        <w:rPr>
-                          <w:rFonts w:asciiTheme="majorBidi" w:hAnsiTheme="majorBidi" w:cstheme="majorBidi"/>
-                          <w:b/>
-                          <w:bCs/>
-                          <w:i/>
-                          <w:iCs/>
-                          <w:sz w:val="28"/>
-                          <w:szCs w:val="28"/>
-                        </w:rPr>
-                        <w:t xml:space="preserve">     </w:t>
-                      </w:r>
-                      <w:r>
-                        <w:rPr>
-                          <w:rFonts w:asciiTheme="majorBidi" w:hAnsiTheme="majorBidi" w:cstheme="majorBidi"/>
-                          <w:b/>
-                          <w:bCs/>
-                          <w:i/>
-                          <w:iCs/>
-                          <w:sz w:val="28"/>
-                          <w:szCs w:val="28"/>
-                        </w:rPr>
-                        <w:t>name: my-pod</w:t>
-                      </w:r>
-                    </w:p>
-                    <w:p>
-                      <w:pPr>
-                        <w:spacing w:after="0"/>
-                        <w:rPr>
-                          <w:rFonts w:asciiTheme="majorBidi" w:hAnsiTheme="majorBidi" w:cstheme="majorBidi"/>
-                          <w:b/>
-                          <w:bCs/>
-                          <w:i/>
-                          <w:iCs/>
-                          <w:sz w:val="28"/>
-                          <w:szCs w:val="28"/>
-                        </w:rPr>
-                      </w:pPr>
-                      <w:r>
-                        <w:rPr>
-                          <w:rFonts w:asciiTheme="majorBidi" w:hAnsiTheme="majorBidi" w:cstheme="majorBidi"/>
-                          <w:b/>
-                          <w:bCs/>
-                          <w:i/>
-                          <w:iCs/>
-                          <w:sz w:val="28"/>
-                          <w:szCs w:val="28"/>
-                        </w:rPr>
-                        <w:t xml:space="preserve">     </w:t>
-                      </w:r>
-                      <w:r>
-                        <w:rPr>
-                          <w:rFonts w:asciiTheme="majorBidi" w:hAnsiTheme="majorBidi" w:cstheme="majorBidi"/>
-                          <w:b/>
-                          <w:bCs/>
-                          <w:i/>
-                          <w:iCs/>
-                          <w:sz w:val="28"/>
-                          <w:szCs w:val="28"/>
-                        </w:rPr>
-                        <w:t>namespace: dev</w:t>
-                      </w:r>
-                    </w:p>
-                    <w:p>
-                      <w:pPr>
-                        <w:spacing w:after="0"/>
-                        <w:jc w:val="center"/>
-                        <w:rPr>
-                          <w:b/>
-                          <w:bCs/>
-                          <w:i/>
-                          <w:iCs/>
-                        </w:rPr>
-                      </w:pPr>
-                    </w:p>
-                  </w:txbxContent>
-                </v:textbox>
-              </v:rect>
-            </w:pict>
-          </mc:Fallback>
-        </mc:AlternateContent>
-      </w:r>
-      <w:r>
-        <w:rPr>
-          <w:rFonts w:asciiTheme="majorBidi" w:hAnsiTheme="majorBidi" w:cstheme="majorBidi"/>
-          <w:sz w:val="28"/>
-          <w:szCs w:val="28"/>
-        </w:rPr>
-        <w:t>In a manifest:</w:t>
-      </w:r>
-    </w:p>
-    <w:p>
-      <w:pPr>
-        <w:jc w:val="both"/>
-        <w:rPr>
-          <w:rFonts w:asciiTheme="majorBidi" w:hAnsiTheme="majorBidi" w:cstheme="majorBidi"/>
-          <w:sz w:val="28"/>
-          <w:szCs w:val="28"/>
-        </w:rPr>
-      </w:pPr>
-    </w:p>
-    <w:p>
-      <w:pPr>
-        <w:jc w:val="both"/>
-        <w:rPr>
-          <w:rFonts w:asciiTheme="majorBidi" w:hAnsiTheme="majorBidi" w:cstheme="majorBidi"/>
-          <w:sz w:val="28"/>
-          <w:szCs w:val="28"/>
-        </w:rPr>
-      </w:pPr>
-    </w:p>
-    <w:p>
-      <w:pPr>
-        <w:spacing w:after="120"/>
-        <w:jc w:val="both"/>
-        <w:rPr>
-          <w:rFonts w:asciiTheme="majorBidi" w:hAnsiTheme="majorBidi" w:cstheme="majorBidi"/>
-          <w:sz w:val="2"/>
-          <w:szCs w:val="2"/>
-        </w:rPr>
-      </w:pPr>
-    </w:p>
-    <w:p>
-      <w:pPr>
-        <w:pStyle w:val="ListParagraph"/>
-        <w:numPr>
-          <w:ilvl w:val="0"/>
-          <w:numId w:val="8"/>
-        </w:numPr>
-        <w:ind w:left="360"/>
-        <w:jc w:val="both"/>
-        <w:rPr>
-          <w:rFonts w:asciiTheme="majorBidi" w:hAnsiTheme="majorBidi" w:cstheme="majorBidi"/>
-          <w:sz w:val="28"/>
-          <w:szCs w:val="28"/>
-        </w:rPr>
-      </w:pPr>
-      <w:r>
-        <w:rPr>
-          <w:rFonts w:asciiTheme="majorBidi" w:hAnsiTheme="majorBidi" w:cstheme="majorBidi"/>
-          <w:sz w:val="28"/>
-          <w:szCs w:val="28"/>
-        </w:rPr>
-        <w:t xml:space="preserve">With </w:t>
-      </w:r>
-      <w:proofErr w:type="spellStart"/>
-      <w:r>
-        <w:rPr>
-          <w:rFonts w:asciiTheme="majorBidi" w:hAnsiTheme="majorBidi" w:cstheme="majorBidi"/>
-          <w:b/>
-          <w:bCs/>
-          <w:i/>
-          <w:iCs/>
-          <w:sz w:val="28"/>
-          <w:szCs w:val="28"/>
-        </w:rPr>
-        <w:t>kubectl</w:t>
-      </w:r>
-      <w:proofErr w:type="spellEnd"/>
-      <w:r>
-        <w:rPr>
-          <w:rFonts w:asciiTheme="majorBidi" w:hAnsiTheme="majorBidi" w:cstheme="majorBidi"/>
-          <w:b/>
-          <w:bCs/>
-          <w:i/>
-          <w:iCs/>
-          <w:sz w:val="28"/>
-          <w:szCs w:val="28"/>
-        </w:rPr>
-        <w:t xml:space="preserve"> </w:t>
-      </w:r>
-      <w:r>
-        <w:rPr>
-          <w:rFonts w:asciiTheme="majorBidi" w:hAnsiTheme="majorBidi" w:cstheme="majorBidi"/>
-          <w:sz w:val="28"/>
-          <w:szCs w:val="28"/>
-        </w:rPr>
-        <w:t xml:space="preserve">→ </w:t>
-      </w:r>
-      <w:proofErr w:type="spellStart"/>
-      <w:r>
-        <w:rPr>
-          <w:rFonts w:asciiTheme="majorBidi" w:hAnsiTheme="majorBidi" w:cstheme="majorBidi"/>
-          <w:b/>
-          <w:bCs/>
-          <w:i/>
-          <w:iCs/>
-          <w:sz w:val="28"/>
-          <w:szCs w:val="28"/>
-        </w:rPr>
-        <w:t>kubectl</w:t>
-      </w:r>
-      <w:proofErr w:type="spellEnd"/>
-      <w:r>
-        <w:rPr>
-          <w:rFonts w:asciiTheme="majorBidi" w:hAnsiTheme="majorBidi" w:cstheme="majorBidi"/>
-          <w:b/>
-          <w:bCs/>
-          <w:i/>
-          <w:iCs/>
-          <w:sz w:val="28"/>
-          <w:szCs w:val="28"/>
-        </w:rPr>
-        <w:t xml:space="preserve"> run nginx --image=nginx -n dev</w:t>
-      </w:r>
-    </w:p>
-    <w:p>
-      <w:pPr>
-        <w:jc w:val="both"/>
-        <w:rPr>
-          <w:rFonts w:asciiTheme="majorBidi" w:hAnsiTheme="majorBidi" w:cstheme="majorBidi"/>
-          <w:b/>
-          <w:bCs/>
-          <w:sz w:val="32"/>
-          <w:szCs w:val="32"/>
-        </w:rPr>
-      </w:pPr>
-      <w:r>
-        <w:rPr>
-          <w:rFonts w:asciiTheme="majorBidi" w:hAnsiTheme="majorBidi" w:cstheme="majorBidi"/>
-          <w:b/>
-          <w:bCs/>
-          <w:sz w:val="32"/>
-          <w:szCs w:val="32"/>
-        </w:rPr>
-        <w:t xml:space="preserve">Setting a Default Namespace for </w:t>
-      </w:r>
-      <w:proofErr w:type="spellStart"/>
-      <w:r>
-        <w:rPr>
-          <w:rFonts w:asciiTheme="majorBidi" w:hAnsiTheme="majorBidi" w:cstheme="majorBidi"/>
-          <w:b/>
-          <w:bCs/>
-          <w:sz w:val="32"/>
-          <w:szCs w:val="32"/>
-        </w:rPr>
-        <w:t>kubectl</w:t>
-      </w:r>
-      <w:proofErr w:type="spellEnd"/>
-    </w:p>
-    <w:p>
-      <w:pPr>
-        <w:spacing w:after="60"/>
-        <w:jc w:val="both"/>
-        <w:rPr>
-          <w:rFonts w:asciiTheme="majorBidi" w:hAnsiTheme="majorBidi" w:cstheme="majorBidi"/>
-          <w:sz w:val="28"/>
-          <w:szCs w:val="28"/>
-        </w:rPr>
-      </w:pPr>
-      <w:r>
-        <w:rPr>
-          <w:rFonts w:asciiTheme="majorBidi" w:hAnsiTheme="majorBidi" w:cstheme="majorBidi"/>
-          <w:sz w:val="28"/>
-          <w:szCs w:val="28"/>
-        </w:rPr>
-        <w:t>Instead of typing -n dev every time</w:t>
-      </w:r>
-      <w:r>
-        <w:rPr>
-          <w:rFonts w:asciiTheme="majorBidi" w:hAnsiTheme="majorBidi" w:cstheme="majorBidi"/>
-          <w:sz w:val="28"/>
-          <w:szCs w:val="28"/>
-        </w:rPr>
-        <w:t xml:space="preserve"> </w:t>
-      </w:r>
-      <w:r>
-        <w:rPr>
-          <w:rFonts w:asciiTheme="majorBidi" w:hAnsiTheme="majorBidi" w:cstheme="majorBidi"/>
-          <w:sz w:val="28"/>
-          <w:szCs w:val="28"/>
-        </w:rPr>
-        <w:t>→</w:t>
-      </w:r>
-      <w:r>
-        <w:rPr>
-          <w:rFonts w:asciiTheme="majorBidi" w:hAnsiTheme="majorBidi" w:cstheme="majorBidi"/>
-          <w:b/>
-          <w:bCs/>
-          <w:i/>
-          <w:iCs/>
-          <w:sz w:val="28"/>
-          <w:szCs w:val="28"/>
-        </w:rPr>
-        <w:t xml:space="preserve"> </w:t>
-      </w:r>
-      <w:proofErr w:type="spellStart"/>
-      <w:r>
-        <w:rPr>
-          <w:rFonts w:asciiTheme="majorBidi" w:hAnsiTheme="majorBidi" w:cstheme="majorBidi"/>
-          <w:b/>
-          <w:bCs/>
-          <w:i/>
-          <w:iCs/>
-          <w:sz w:val="28"/>
-          <w:szCs w:val="28"/>
-        </w:rPr>
-        <w:t>kubectl</w:t>
-      </w:r>
-      <w:proofErr w:type="spellEnd"/>
-      <w:r>
-        <w:rPr>
-          <w:rFonts w:asciiTheme="majorBidi" w:hAnsiTheme="majorBidi" w:cstheme="majorBidi"/>
-          <w:b/>
-          <w:bCs/>
-          <w:i/>
-          <w:iCs/>
-          <w:sz w:val="28"/>
-          <w:szCs w:val="28"/>
-        </w:rPr>
-        <w:t xml:space="preserve"> config set-context --current --namespace=dev</w:t>
-      </w:r>
-    </w:p>
-    <w:p>
-      <w:pPr>
-        <w:jc w:val="both"/>
-        <w:rPr>
-          <w:rFonts w:asciiTheme="majorBidi" w:hAnsiTheme="majorBidi" w:cstheme="majorBidi"/>
-          <w:sz w:val="28"/>
-          <w:szCs w:val="28"/>
-        </w:rPr>
-      </w:pPr>
-      <w:r>
-        <w:rPr>
-          <w:rFonts w:asciiTheme="majorBidi" w:hAnsiTheme="majorBidi" w:cstheme="majorBidi"/>
-          <w:sz w:val="28"/>
-          <w:szCs w:val="28"/>
-        </w:rPr>
-        <w:t xml:space="preserve">Now commands like </w:t>
-      </w:r>
-      <w:proofErr w:type="spellStart"/>
-      <w:r>
-        <w:rPr>
-          <w:rFonts w:asciiTheme="majorBidi" w:hAnsiTheme="majorBidi" w:cstheme="majorBidi"/>
-          <w:b/>
-          <w:bCs/>
-          <w:i/>
-          <w:iCs/>
-          <w:sz w:val="28"/>
-          <w:szCs w:val="28"/>
-        </w:rPr>
-        <w:t>kubectl</w:t>
-      </w:r>
-      <w:proofErr w:type="spellEnd"/>
-      <w:r>
-        <w:rPr>
-          <w:rFonts w:asciiTheme="majorBidi" w:hAnsiTheme="majorBidi" w:cstheme="majorBidi"/>
-          <w:b/>
-          <w:bCs/>
-          <w:i/>
-          <w:iCs/>
-          <w:sz w:val="28"/>
-          <w:szCs w:val="28"/>
-        </w:rPr>
-        <w:t xml:space="preserve"> get pods</w:t>
-      </w:r>
-      <w:r>
-        <w:rPr>
-          <w:rFonts w:asciiTheme="majorBidi" w:hAnsiTheme="majorBidi" w:cstheme="majorBidi"/>
-          <w:sz w:val="28"/>
-          <w:szCs w:val="28"/>
-        </w:rPr>
-        <w:t xml:space="preserve"> will automatically use the </w:t>
-      </w:r>
-      <w:r>
-        <w:rPr>
-          <w:rFonts w:asciiTheme="majorBidi" w:hAnsiTheme="majorBidi" w:cstheme="majorBidi"/>
-          <w:b/>
-          <w:bCs/>
-          <w:i/>
-          <w:iCs/>
-          <w:sz w:val="28"/>
-          <w:szCs w:val="28"/>
-        </w:rPr>
-        <w:t>dev</w:t>
-      </w:r>
-      <w:r>
-        <w:rPr>
-          <w:rFonts w:asciiTheme="majorBidi" w:hAnsiTheme="majorBidi" w:cstheme="majorBidi"/>
-          <w:sz w:val="28"/>
-          <w:szCs w:val="28"/>
-        </w:rPr>
-        <w:t xml:space="preserve"> namespace.</w:t>
-      </w:r>
-    </w:p>
-    <w:p>
-      <w:pPr>
-        <w:pStyle w:val="ListParagraph"/>
-        <w:numPr>
-          <w:ilvl w:val="0"/>
-          <w:numId w:val="9"/>
-        </w:numPr>
-        <w:spacing w:after="120"/>
-        <w:ind w:left="360"/>
-        <w:jc w:val="both"/>
-        <w:rPr>
-          <w:rFonts w:asciiTheme="majorBidi" w:hAnsiTheme="majorBidi" w:cstheme="majorBidi"/>
-          <w:sz w:val="28"/>
-          <w:szCs w:val="28"/>
-        </w:rPr>
-      </w:pPr>
-      <w:r>
-        <w:rPr>
-          <w:rFonts w:asciiTheme="majorBidi" w:hAnsiTheme="majorBidi" w:cstheme="majorBidi"/>
-          <w:sz w:val="28"/>
-          <w:szCs w:val="28"/>
-        </w:rPr>
-        <w:t xml:space="preserve">Nodes and </w:t>
-      </w:r>
-      <w:r>
-        <w:rPr>
-          <w:rFonts w:asciiTheme="majorBidi" w:hAnsiTheme="majorBidi" w:cstheme="majorBidi"/>
-          <w:b/>
-          <w:bCs/>
-          <w:i/>
-          <w:iCs/>
-          <w:sz w:val="28"/>
-          <w:szCs w:val="28"/>
-        </w:rPr>
-        <w:t>PersistentVolumes</w:t>
-      </w:r>
-      <w:r>
-        <w:rPr>
-          <w:rFonts w:asciiTheme="majorBidi" w:hAnsiTheme="majorBidi" w:cstheme="majorBidi"/>
-          <w:sz w:val="28"/>
-          <w:szCs w:val="28"/>
-        </w:rPr>
-        <w:t xml:space="preserve"> are cluster-scoped resources, which means they do not belong to any namespace. In Kubernetes, some objects exist at the cluster level rather than inside namespaces. A Node represents a physical or virtual machine that is part of the cluster and provides resources (CPU, memory, storage) for running Pods, so it must be visible to the entire cluster. A </w:t>
-      </w:r>
-      <w:proofErr w:type="spellStart"/>
-      <w:r>
-        <w:rPr>
-          <w:rFonts w:asciiTheme="majorBidi" w:hAnsiTheme="majorBidi" w:cstheme="majorBidi"/>
-          <w:b/>
-          <w:bCs/>
-          <w:i/>
-          <w:iCs/>
-          <w:sz w:val="28"/>
-          <w:szCs w:val="28"/>
-        </w:rPr>
-        <w:t>PersistentVolume</w:t>
-      </w:r>
-      <w:proofErr w:type="spellEnd"/>
-      <w:r>
-        <w:rPr>
-          <w:rFonts w:asciiTheme="majorBidi" w:hAnsiTheme="majorBidi" w:cstheme="majorBidi"/>
-          <w:sz w:val="28"/>
-          <w:szCs w:val="28"/>
-        </w:rPr>
-        <w:t xml:space="preserve"> (</w:t>
-      </w:r>
-      <w:r>
-        <w:rPr>
-          <w:rFonts w:asciiTheme="majorBidi" w:hAnsiTheme="majorBidi" w:cstheme="majorBidi"/>
-          <w:b/>
-          <w:bCs/>
-          <w:i/>
-          <w:iCs/>
-          <w:sz w:val="28"/>
-          <w:szCs w:val="28"/>
-        </w:rPr>
-        <w:t>PV</w:t>
-      </w:r>
-      <w:r>
-        <w:rPr>
-          <w:rFonts w:asciiTheme="majorBidi" w:hAnsiTheme="majorBidi" w:cstheme="majorBidi"/>
-          <w:sz w:val="28"/>
-          <w:szCs w:val="28"/>
-        </w:rPr>
-        <w:t xml:space="preserve">) is also available cluster-wide so that any namespace can request storage through a </w:t>
-      </w:r>
-      <w:proofErr w:type="spellStart"/>
-      <w:r>
-        <w:rPr>
-          <w:rFonts w:asciiTheme="majorBidi" w:hAnsiTheme="majorBidi" w:cstheme="majorBidi"/>
-          <w:b/>
-          <w:bCs/>
-          <w:i/>
-          <w:iCs/>
-          <w:sz w:val="28"/>
-          <w:szCs w:val="28"/>
-        </w:rPr>
-        <w:t>PersistentVolumeClaim</w:t>
-      </w:r>
-      <w:proofErr w:type="spellEnd"/>
-      <w:r>
-        <w:rPr>
-          <w:rFonts w:asciiTheme="majorBidi" w:hAnsiTheme="majorBidi" w:cstheme="majorBidi"/>
-          <w:sz w:val="28"/>
-          <w:szCs w:val="28"/>
-        </w:rPr>
-        <w:t xml:space="preserve"> (</w:t>
-      </w:r>
-      <w:r>
-        <w:rPr>
-          <w:rFonts w:asciiTheme="majorBidi" w:hAnsiTheme="majorBidi" w:cstheme="majorBidi"/>
-          <w:b/>
-          <w:bCs/>
-          <w:i/>
-          <w:iCs/>
-          <w:sz w:val="28"/>
-          <w:szCs w:val="28"/>
-        </w:rPr>
-        <w:t>PVC</w:t>
-      </w:r>
-      <w:r>
-        <w:rPr>
-          <w:rFonts w:asciiTheme="majorBidi" w:hAnsiTheme="majorBidi" w:cstheme="majorBidi"/>
-          <w:sz w:val="28"/>
-          <w:szCs w:val="28"/>
-        </w:rPr>
-        <w:t>). Because these resources serve the whole cluster rather than a single logical environment, Kubernetes defines them as non‑</w:t>
-      </w:r>
-      <w:proofErr w:type="spellStart"/>
-      <w:r>
-        <w:rPr>
-          <w:rFonts w:asciiTheme="majorBidi" w:hAnsiTheme="majorBidi" w:cstheme="majorBidi"/>
-          <w:sz w:val="28"/>
-          <w:szCs w:val="28"/>
-        </w:rPr>
-        <w:t>namespaced</w:t>
-      </w:r>
-      <w:proofErr w:type="spellEnd"/>
-      <w:r>
-        <w:rPr>
-          <w:rFonts w:asciiTheme="majorBidi" w:hAnsiTheme="majorBidi" w:cstheme="majorBidi"/>
-          <w:sz w:val="28"/>
-          <w:szCs w:val="28"/>
-        </w:rPr>
-        <w:t xml:space="preserve"> objects.</w:t>
-      </w:r>
-    </w:p>
-    <w:p>
-      <w:pPr>
-        <w:spacing w:after="60"/>
-        <w:jc w:val="both"/>
-        <w:rPr>
-          <w:rFonts w:asciiTheme="majorBidi" w:hAnsiTheme="majorBidi" w:cstheme="majorBidi"/>
-          <w:b/>
-          <w:bCs/>
-          <w:sz w:val="32"/>
-          <w:szCs w:val="32"/>
-        </w:rPr>
-      </w:pPr>
-      <w:proofErr w:type="spellStart"/>
-      <w:r>
-        <w:rPr>
-          <w:rFonts w:asciiTheme="majorBidi" w:hAnsiTheme="majorBidi" w:cstheme="majorBidi"/>
-          <w:b/>
-          <w:bCs/>
-          <w:i/>
-          <w:iCs/>
-          <w:sz w:val="32"/>
-          <w:szCs w:val="32"/>
-        </w:rPr>
-        <w:t>kubectl</w:t>
-      </w:r>
-      <w:proofErr w:type="spellEnd"/>
-      <w:r>
-        <w:rPr>
-          <w:rFonts w:asciiTheme="majorBidi" w:hAnsiTheme="majorBidi" w:cstheme="majorBidi"/>
-          <w:b/>
-          <w:bCs/>
-          <w:i/>
-          <w:iCs/>
-          <w:sz w:val="32"/>
-          <w:szCs w:val="32"/>
-        </w:rPr>
-        <w:t xml:space="preserve"> </w:t>
-      </w:r>
-      <w:proofErr w:type="spellStart"/>
-      <w:r>
-        <w:rPr>
-          <w:rFonts w:asciiTheme="majorBidi" w:hAnsiTheme="majorBidi" w:cstheme="majorBidi"/>
-          <w:b/>
-          <w:bCs/>
-          <w:i/>
-          <w:iCs/>
-          <w:sz w:val="32"/>
-          <w:szCs w:val="32"/>
-        </w:rPr>
-        <w:t>api</w:t>
-      </w:r>
-      <w:proofErr w:type="spellEnd"/>
-      <w:r>
-        <w:rPr>
-          <w:rFonts w:asciiTheme="majorBidi" w:hAnsiTheme="majorBidi" w:cstheme="majorBidi"/>
-          <w:b/>
-          <w:bCs/>
-          <w:i/>
-          <w:iCs/>
-          <w:sz w:val="32"/>
-          <w:szCs w:val="32"/>
-        </w:rPr>
-        <w:t>-resources</w:t>
-      </w:r>
-      <w:r>
-        <w:rPr>
-          <w:rFonts w:asciiTheme="majorBidi" w:hAnsiTheme="majorBidi" w:cstheme="majorBidi"/>
-          <w:b/>
-          <w:bCs/>
-          <w:sz w:val="32"/>
-          <w:szCs w:val="32"/>
-        </w:rPr>
-        <w:t xml:space="preserve"> command</w:t>
-      </w:r>
-      <w:r>
-        <w:rPr>
-          <w:rFonts w:asciiTheme="majorBidi" w:hAnsiTheme="majorBidi" w:cstheme="majorBidi"/>
-          <w:b/>
-          <w:bCs/>
-          <w:sz w:val="32"/>
-          <w:szCs w:val="32"/>
-        </w:rPr>
-        <w:t>:</w:t>
-      </w:r>
-    </w:p>
-    <w:p>
-      <w:pPr>
-        <w:spacing w:after="60"/>
-        <w:jc w:val="both"/>
-        <w:rPr>
-          <w:rFonts w:asciiTheme="majorBidi" w:hAnsiTheme="majorBidi" w:cstheme="majorBidi"/>
-          <w:sz w:val="28"/>
-          <w:szCs w:val="28"/>
-        </w:rPr>
-      </w:pPr>
-      <w:proofErr w:type="spellStart"/>
-      <w:r>
-        <w:rPr>
-          <w:rFonts w:asciiTheme="majorBidi" w:hAnsiTheme="majorBidi" w:cstheme="majorBidi"/>
-          <w:b/>
-          <w:bCs/>
-          <w:i/>
-          <w:iCs/>
-          <w:sz w:val="28"/>
-          <w:szCs w:val="28"/>
-        </w:rPr>
-        <w:lastRenderedPageBreak/>
-        <w:t>kubectl</w:t>
-      </w:r>
-      <w:proofErr w:type="spellEnd"/>
-      <w:r>
-        <w:rPr>
-          <w:rFonts w:asciiTheme="majorBidi" w:hAnsiTheme="majorBidi" w:cstheme="majorBidi"/>
-          <w:b/>
-          <w:bCs/>
-          <w:i/>
-          <w:iCs/>
-          <w:sz w:val="28"/>
-          <w:szCs w:val="28"/>
-        </w:rPr>
-        <w:t xml:space="preserve"> </w:t>
-      </w:r>
-      <w:proofErr w:type="spellStart"/>
-      <w:r>
-        <w:rPr>
-          <w:rFonts w:asciiTheme="majorBidi" w:hAnsiTheme="majorBidi" w:cstheme="majorBidi"/>
-          <w:b/>
-          <w:bCs/>
-          <w:i/>
-          <w:iCs/>
-          <w:sz w:val="28"/>
-          <w:szCs w:val="28"/>
-        </w:rPr>
-        <w:t>api</w:t>
-      </w:r>
-      <w:proofErr w:type="spellEnd"/>
-      <w:r>
-        <w:rPr>
-          <w:rFonts w:asciiTheme="majorBidi" w:hAnsiTheme="majorBidi" w:cstheme="majorBidi"/>
-          <w:b/>
-          <w:bCs/>
-          <w:i/>
-          <w:iCs/>
-          <w:sz w:val="28"/>
-          <w:szCs w:val="28"/>
-        </w:rPr>
-        <w:t>-resources</w:t>
-      </w:r>
-      <w:r>
-        <w:rPr>
-          <w:rFonts w:asciiTheme="majorBidi" w:hAnsiTheme="majorBidi" w:cstheme="majorBidi"/>
-          <w:sz w:val="28"/>
-          <w:szCs w:val="28"/>
-        </w:rPr>
-        <w:t xml:space="preserve"> displays the list of all resource types that the Kubernetes API server supports in the cluster.</w:t>
-      </w:r>
-      <w:r>
-        <w:rPr>
-          <w:rFonts w:asciiTheme="majorBidi" w:hAnsiTheme="majorBidi" w:cstheme="majorBidi"/>
-          <w:sz w:val="28"/>
-          <w:szCs w:val="28"/>
-        </w:rPr>
-        <w:t xml:space="preserve"> </w:t>
-      </w:r>
-      <w:r>
-        <w:rPr>
-          <w:rFonts w:asciiTheme="majorBidi" w:hAnsiTheme="majorBidi" w:cstheme="majorBidi"/>
-          <w:sz w:val="28"/>
-          <w:szCs w:val="28"/>
-        </w:rPr>
-        <w:t>It shows information such as:</w:t>
-      </w:r>
-    </w:p>
-    <w:p>
-      <w:pPr>
-        <w:pStyle w:val="ListParagraph"/>
-        <w:numPr>
-          <w:ilvl w:val="0"/>
-          <w:numId w:val="10"/>
-        </w:numPr>
-        <w:ind w:left="360"/>
-        <w:jc w:val="both"/>
-        <w:rPr>
-          <w:rFonts w:asciiTheme="majorBidi" w:hAnsiTheme="majorBidi" w:cstheme="majorBidi"/>
-          <w:sz w:val="28"/>
-          <w:szCs w:val="28"/>
-        </w:rPr>
-      </w:pPr>
-      <w:r>
-        <w:rPr>
-          <w:rFonts w:asciiTheme="majorBidi" w:hAnsiTheme="majorBidi" w:cstheme="majorBidi"/>
-          <w:sz w:val="28"/>
-          <w:szCs w:val="28"/>
-        </w:rPr>
-        <w:t>resource name</w:t>
-      </w:r>
-    </w:p>
-    <w:p>
-      <w:pPr>
-        <w:pStyle w:val="ListParagraph"/>
-        <w:numPr>
-          <w:ilvl w:val="0"/>
-          <w:numId w:val="10"/>
-        </w:numPr>
-        <w:ind w:left="360"/>
-        <w:jc w:val="both"/>
-        <w:rPr>
-          <w:rFonts w:asciiTheme="majorBidi" w:hAnsiTheme="majorBidi" w:cstheme="majorBidi"/>
-          <w:sz w:val="28"/>
-          <w:szCs w:val="28"/>
-        </w:rPr>
-      </w:pPr>
-      <w:r>
-        <w:rPr>
-          <w:rFonts w:asciiTheme="majorBidi" w:hAnsiTheme="majorBidi" w:cstheme="majorBidi"/>
-          <w:sz w:val="28"/>
-          <w:szCs w:val="28"/>
-        </w:rPr>
-        <w:t>short name</w:t>
-      </w:r>
-    </w:p>
-    <w:p>
-      <w:pPr>
-        <w:pStyle w:val="ListParagraph"/>
-        <w:numPr>
-          <w:ilvl w:val="0"/>
-          <w:numId w:val="10"/>
-        </w:numPr>
-        <w:ind w:left="360"/>
-        <w:jc w:val="both"/>
-        <w:rPr>
-          <w:rFonts w:asciiTheme="majorBidi" w:hAnsiTheme="majorBidi" w:cstheme="majorBidi"/>
-          <w:sz w:val="28"/>
-          <w:szCs w:val="28"/>
-        </w:rPr>
-      </w:pPr>
-      <w:r>
-        <w:rPr>
-          <w:rFonts w:asciiTheme="majorBidi" w:hAnsiTheme="majorBidi" w:cstheme="majorBidi"/>
-          <w:sz w:val="28"/>
-          <w:szCs w:val="28"/>
-        </w:rPr>
-        <w:t>API group</w:t>
-      </w:r>
-    </w:p>
-    <w:p>
-      <w:pPr>
-        <w:pStyle w:val="ListParagraph"/>
-        <w:numPr>
-          <w:ilvl w:val="0"/>
-          <w:numId w:val="10"/>
-        </w:numPr>
-        <w:ind w:left="360"/>
-        <w:jc w:val="both"/>
-        <w:rPr>
-          <w:rFonts w:asciiTheme="majorBidi" w:hAnsiTheme="majorBidi" w:cstheme="majorBidi"/>
-          <w:sz w:val="28"/>
-          <w:szCs w:val="28"/>
-        </w:rPr>
-      </w:pPr>
-      <w:r>
-        <w:rPr>
-          <w:rFonts w:asciiTheme="majorBidi" w:hAnsiTheme="majorBidi" w:cstheme="majorBidi"/>
-          <w:sz w:val="28"/>
-          <w:szCs w:val="28"/>
-        </w:rPr>
-        <w:t xml:space="preserve">whether the resource is </w:t>
-      </w:r>
-      <w:proofErr w:type="spellStart"/>
-      <w:r>
-        <w:rPr>
-          <w:rFonts w:asciiTheme="majorBidi" w:hAnsiTheme="majorBidi" w:cstheme="majorBidi"/>
-          <w:sz w:val="28"/>
-          <w:szCs w:val="28"/>
-        </w:rPr>
-        <w:t>namespaced</w:t>
-      </w:r>
-      <w:proofErr w:type="spellEnd"/>
-      <w:r>
-        <w:rPr>
-          <w:rFonts w:asciiTheme="majorBidi" w:hAnsiTheme="majorBidi" w:cstheme="majorBidi"/>
-          <w:sz w:val="28"/>
-          <w:szCs w:val="28"/>
-        </w:rPr>
-        <w:t xml:space="preserve"> or cluster-wide</w:t>
-      </w:r>
-    </w:p>
-    <w:p>
-      <w:pPr>
-        <w:pStyle w:val="ListParagraph"/>
-        <w:numPr>
-          <w:ilvl w:val="0"/>
-          <w:numId w:val="10"/>
-        </w:numPr>
-        <w:spacing w:after="120"/>
-        <w:ind w:left="360"/>
-        <w:jc w:val="both"/>
-        <w:rPr>
-          <w:rFonts w:asciiTheme="majorBidi" w:hAnsiTheme="majorBidi" w:cstheme="majorBidi"/>
-          <w:sz w:val="28"/>
-          <w:szCs w:val="28"/>
-        </w:rPr>
-      </w:pPr>
-      <w:r>
-        <w:rPr>
-          <w:rFonts w:asciiTheme="majorBidi" w:hAnsiTheme="majorBidi" w:cstheme="majorBidi"/>
-          <w:sz w:val="28"/>
-          <w:szCs w:val="28"/>
-        </w:rPr>
-        <w:t>the kind</w:t>
-      </w:r>
-    </w:p>
     <w:p>
       <w:pPr>
         <w:spacing w:after="80"/>
@@ -2948,7 +220,7 @@
           </mc:Choice>
           <mc:Fallback>
             <w:pict>
-              <v:rect w14:anchorId="7B2AAC5C" id="Rectangle 3" o:spid="_x0000_s1028" style="position:absolute;left:0;text-align:left;margin-left:0;margin-top:42pt;width:143.4pt;height:81pt;z-index:251661312;visibility:visible;mso-wrap-style:square;mso-width-percent:0;mso-height-percent:0;mso-wrap-distance-left:9pt;mso-wrap-distance-top:0;mso-wrap-distance-right:9pt;mso-wrap-distance-bottom:0;mso-position-horizontal:left;mso-position-horizontal-relative:margin;mso-position-vertical:absolute;mso-position-vertical-relative:text;mso-width-percent:0;mso-height-percent:0;mso-width-relative:margin;mso-height-relative:margin;v-text-anchor:middle" o:gfxdata="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" fillcolor="black [3200]" strokecolor="black [480]" strokeweight="1pt">
+              <v:rect w14:anchorId="7B2AAC5C" id="Rectangle 3" o:spid="_x0000_s1026" style="position:absolute;left:0;text-align:left;margin-left:0;margin-top:42pt;width:143.4pt;height:81pt;z-index:251661312;visibility:visible;mso-wrap-style:square;mso-width-percent:0;mso-height-percent:0;mso-wrap-distance-left:9pt;mso-wrap-distance-top:0;mso-wrap-distance-right:9pt;mso-wrap-distance-bottom:0;mso-position-horizontal:left;mso-position-horizontal-relative:margin;mso-position-vertical:absolute;mso-position-vertical-relative:text;mso-width-percent:0;mso-height-percent:0;mso-width-relative:margin;mso-height-relative:margin;v-text-anchor:middle" o:gfxdata="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" fillcolor="black [3200]" strokecolor="black [480]" strokeweight="1pt">
                 <v:textbox>
                   <w:txbxContent>
                     <w:p>
@@ -3818,7 +1090,6 @@
           <w:sz w:val="28"/>
           <w:szCs w:val="28"/>
         </w:rPr>
-        <w:lastRenderedPageBreak/>
         <w:t>kubectl</w:t>
       </w:r>
       <w:proofErr w:type="spellEnd"/>
@@ -4421,7 +1692,7 @@
           </mc:Choice>
           <mc:Fallback>
             <w:pict>
-              <v:rect w14:anchorId="5774B543" id="Rectangle 4" o:spid="_x0000_s1029" style="position:absolute;left:0;text-align:left;margin-left:0;margin-top:.8pt;width:279.6pt;height:214.8pt;z-index:251662336;visibility:visible;mso-wrap-style:square;mso-width-percent:0;mso-height-percent:0;mso-wrap-distance-left:9pt;mso-wrap-distance-top:0;mso-wrap-distance-right:9pt;mso-wrap-distance-bottom:0;mso-position-horizontal:left;mso-position-horizontal-relative:margin;mso-position-vertical:absolute;mso-position-vertical-relative:text;mso-width-percent:0;mso-height-percent:0;mso-width-relative:margin;mso-height-relative:margin;v-text-anchor:middle" o:gfxdata="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" fillcolor="black [3200]" strokecolor="black [480]" strokeweight="1pt">
+              <v:rect w14:anchorId="5774B543" id="Rectangle 4" o:spid="_x0000_s1027" style="position:absolute;left:0;text-align:left;margin-left:0;margin-top:.8pt;width:279.6pt;height:214.8pt;z-index:251662336;visibility:visible;mso-wrap-style:square;mso-width-percent:0;mso-height-percent:0;mso-wrap-distance-left:9pt;mso-wrap-distance-top:0;mso-wrap-distance-right:9pt;mso-wrap-distance-bottom:0;mso-position-horizontal:left;mso-position-horizontal-relative:margin;mso-position-vertical:absolute;mso-position-vertical-relative:text;mso-width-percent:0;mso-height-percent:0;mso-width-relative:margin;mso-height-relative:margin;v-text-anchor:middle" o:gfxdata="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" fillcolor="black [3200]" strokecolor="black [480]" strokeweight="1pt">
                 <v:textbox>
                   <w:txbxContent>
                     <w:p>
@@ -5057,7 +2328,7 @@
           </mc:Choice>
           <mc:Fallback>
             <w:pict>
-              <v:rect w14:anchorId="42FA36C3" id="Rectangle 5" o:spid="_x0000_s1030" style="position:absolute;left:0;text-align:left;margin-left:0;margin-top:24.45pt;width:97.8pt;height:45.6pt;z-index:251663360;visibility:visible;mso-wrap-style:square;mso-width-percent:0;mso-height-percent:0;mso-wrap-distance-left:9pt;mso-wrap-distance-top:0;mso-wrap-distance-right:9pt;mso-wrap-distance-bottom:0;mso-position-horizontal:left;mso-position-horizontal-relative:margin;mso-position-vertical:absolute;mso-position-vertical-relative:text;mso-width-percent:0;mso-height-percent:0;mso-width-relative:margin;mso-height-relative:margin;v-text-anchor:middle" o:gfxdata="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" fillcolor="black [3200]" strokecolor="black [480]" strokeweight="1pt">
+              <v:rect w14:anchorId="42FA36C3" id="Rectangle 5" o:spid="_x0000_s1028" style="position:absolute;left:0;text-align:left;margin-left:0;margin-top:24.45pt;width:97.8pt;height:45.6pt;z-index:251663360;visibility:visible;mso-wrap-style:square;mso-width-percent:0;mso-height-percent:0;mso-wrap-distance-left:9pt;mso-wrap-distance-top:0;mso-wrap-distance-right:9pt;mso-wrap-distance-bottom:0;mso-position-horizontal:left;mso-position-horizontal-relative:margin;mso-position-vertical:absolute;mso-position-vertical-relative:text;mso-width-percent:0;mso-height-percent:0;mso-width-relative:margin;mso-height-relative:margin;v-text-anchor:middle" o:gfxdata="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" fillcolor="black [3200]" strokecolor="black [480]" strokeweight="1pt">
                 <v:textbox>
                   <w:txbxContent>
                     <w:p>
@@ -5420,7 +2691,7 @@
           </mc:Choice>
           <mc:Fallback>
             <w:pict>
-              <v:rect w14:anchorId="1C1D569A" id="Rectangle 6" o:spid="_x0000_s1031" style="position:absolute;left:0;text-align:left;margin-left:0;margin-top:61.2pt;width:403.2pt;height:83.4pt;z-index:251664384;visibility:visible;mso-wrap-style:square;mso-width-percent:0;mso-height-percent:0;mso-wrap-distance-left:9pt;mso-wrap-distance-top:0;mso-wrap-distance-right:9pt;mso-wrap-distance-bottom:0;mso-position-horizontal:left;mso-position-horizontal-relative:margin;mso-position-vertical:absolute;mso-position-vertical-relative:text;mso-width-percent:0;mso-height-percent:0;mso-width-relative:margin;mso-height-relative:margin;v-text-anchor:middle" o:gfxdata="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" fillcolor="black [3200]" strokecolor="black [480]" strokeweight="1pt">
+              <v:rect w14:anchorId="1C1D569A" id="Rectangle 6" o:spid="_x0000_s1029" style="position:absolute;left:0;text-align:left;margin-left:0;margin-top:61.2pt;width:403.2pt;height:83.4pt;z-index:251664384;visibility:visible;mso-wrap-style:square;mso-width-percent:0;mso-height-percent:0;mso-wrap-distance-left:9pt;mso-wrap-distance-top:0;mso-wrap-distance-right:9pt;mso-wrap-distance-bottom:0;mso-position-horizontal:left;mso-position-horizontal-relative:margin;mso-position-vertical:absolute;mso-position-vertical-relative:text;mso-width-percent:0;mso-height-percent:0;mso-width-relative:margin;mso-height-relative:margin;v-text-anchor:middle" o:gfxdata="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" fillcolor="black [3200]" strokecolor="black [480]" strokeweight="1pt">
                 <v:textbox>
                   <w:txbxContent>
                     <w:p>
@@ -5801,7 +3072,6 @@
           <w:sz w:val="28"/>
           <w:szCs w:val="28"/>
         </w:rPr>
-        <w:lastRenderedPageBreak/>
         <w:t>For example, CI/CD systems, monitoring tools, and Kubernetes extensions often store information in annotations.</w:t>
       </w:r>
     </w:p>
@@ -5950,6 +3220,7 @@
           <w:szCs w:val="28"/>
           <w:u w:val="single"/>
         </w:rPr>
+        <w:lastRenderedPageBreak/>
         <mc:AlternateContent>
           <mc:Choice Requires="wps">
             <w:drawing>
@@ -6377,7 +3648,7 @@
           </mc:Choice>
           <mc:Fallback>
             <w:pict>
-              <v:rect w14:anchorId="56DCF595" id="Rectangle 7" o:spid="_x0000_s1032" style="position:absolute;left:0;text-align:left;margin-left:0;margin-top:22.55pt;width:364.2pt;height:249pt;z-index:251665408;visibility:visible;mso-wrap-style:square;mso-width-percent:0;mso-height-percent:0;mso-wrap-distance-left:9pt;mso-wrap-distance-top:0;mso-wrap-distance-right:9pt;mso-wrap-distance-bottom:0;mso-position-horizontal:left;mso-position-horizontal-relative:margin;mso-position-vertical:absolute;mso-position-vertical-relative:text;mso-width-percent:0;mso-height-percent:0;mso-width-relative:margin;mso-height-relative:margin;v-text-anchor:middle" o:gfxdata="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" fillcolor="black [3200]" strokecolor="black [480]" strokeweight="1pt">
+              <v:rect w14:anchorId="56DCF595" id="Rectangle 7" o:spid="_x0000_s1030" style="position:absolute;left:0;text-align:left;margin-left:0;margin-top:22.55pt;width:364.2pt;height:249pt;z-index:251665408;visibility:visible;mso-wrap-style:square;mso-width-percent:0;mso-height-percent:0;mso-wrap-distance-left:9pt;mso-wrap-distance-top:0;mso-wrap-distance-right:9pt;mso-wrap-distance-bottom:0;mso-position-horizontal:left;mso-position-horizontal-relative:margin;mso-position-vertical:absolute;mso-position-vertical-relative:text;mso-width-percent:0;mso-height-percent:0;mso-width-relative:margin;mso-height-relative:margin;v-text-anchor:middle" o:gfxdata="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" fillcolor="black [3200]" strokecolor="black [480]" strokeweight="1pt">
                 <v:textbox>
                   <w:txbxContent>
                     <w:p>
@@ -7320,7 +4591,7 @@
           </mc:Choice>
           <mc:Fallback>
             <w:pict>
-              <v:rect w14:anchorId="58D3485D" id="Rectangle 8" o:spid="_x0000_s1033" style="position:absolute;left:0;text-align:left;margin-left:0;margin-top:21.9pt;width:269.4pt;height:119.4pt;z-index:251666432;visibility:visible;mso-wrap-style:square;mso-width-percent:0;mso-height-percent:0;mso-wrap-distance-left:9pt;mso-wrap-distance-top:0;mso-wrap-distance-right:9pt;mso-wrap-distance-bottom:0;mso-position-horizontal:left;mso-position-horizontal-relative:margin;mso-position-vertical:absolute;mso-position-vertical-relative:text;mso-width-percent:0;mso-height-percent:0;mso-width-relative:margin;mso-height-relative:margin;v-text-anchor:middle" o:gfxdata="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" fillcolor="black [3200]" strokecolor="black [480]" strokeweight="1pt">
+              <v:rect w14:anchorId="58D3485D" id="Rectangle 8" o:spid="_x0000_s1031" style="position:absolute;left:0;text-align:left;margin-left:0;margin-top:21.9pt;width:269.4pt;height:119.4pt;z-index:251666432;visibility:visible;mso-wrap-style:square;mso-width-percent:0;mso-height-percent:0;mso-wrap-distance-left:9pt;mso-wrap-distance-top:0;mso-wrap-distance-right:9pt;mso-wrap-distance-bottom:0;mso-position-horizontal:left;mso-position-horizontal-relative:margin;mso-position-vertical:absolute;mso-position-vertical-relative:text;mso-width-percent:0;mso-height-percent:0;mso-width-relative:margin;mso-height-relative:margin;v-text-anchor:middle" o:gfxdata="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" fillcolor="black [3200]" strokecolor="black [480]" strokeweight="1pt">
                 <v:textbox>
                   <w:txbxContent>
                     <w:p>
@@ -7568,7 +4839,6 @@
           <w:sz w:val="28"/>
           <w:szCs w:val="28"/>
         </w:rPr>
-        <w:lastRenderedPageBreak/>
         <w:t>Here</w:t>
       </w:r>
       <w:r>
@@ -7647,6 +4917,7 @@
           <w:sz w:val="28"/>
           <w:szCs w:val="28"/>
         </w:rPr>
+        <w:lastRenderedPageBreak/>
         <w:t>In other words, annotations work like optional attributes attached to a resource. They provide additional information that external systems or applications may interpret. Kubernetes itself usually does not enforce or process these annotations unless a component is specifically designed to use them.</w:t>
       </w:r>
     </w:p>
@@ -7843,16 +5114,7 @@
           <w:sz w:val="28"/>
           <w:szCs w:val="28"/>
         </w:rPr>
-        <w:t xml:space="preserve">Another reason Pods exist is to support situations where multiple containers must run closely together and depend on each other. When containers are tightly coupled and must share the same environment, they are placed in the same Pod. Containers in a Pod share the same network (IP address and ports) and can also share storage volumes, which makes communication and coordination between them very easy. Because of this, related containers </w:t>
-      </w:r>
-      <w:r>
-        <w:rPr>
-          <w:rFonts w:asciiTheme="majorBidi" w:hAnsiTheme="majorBidi" w:cstheme="majorBidi"/>
-          <w:sz w:val="28"/>
-          <w:szCs w:val="28"/>
-        </w:rPr>
-        <w:lastRenderedPageBreak/>
-        <w:t>that form a single functional unit are grouped into one Pod rather than being deployed separately.</w:t>
+        <w:t>Another reason Pods exist is to support situations where multiple containers must run closely together and depend on each other. When containers are tightly coupled and must share the same environment, they are placed in the same Pod. Containers in a Pod share the same network (IP address and ports) and can also share storage volumes, which makes communication and coordination between them very easy. Because of this, related containers that form a single functional unit are grouped into one Pod rather than being deployed separately.</w:t>
       </w:r>
     </w:p>
     <w:p>
@@ -7970,6 +5232,7 @@
           <w:sz w:val="28"/>
           <w:szCs w:val="28"/>
         </w:rPr>
+        <w:lastRenderedPageBreak/>
         <w:t>A main application container</w:t>
       </w:r>
       <w:r>
@@ -8879,7 +6142,7 @@
           </mc:Choice>
           <mc:Fallback>
             <w:pict>
-              <v:rect w14:anchorId="352A97F6" id="Rectangle 10" o:spid="_x0000_s1034" style="position:absolute;left:0;text-align:left;margin-left:0;margin-top:22.1pt;width:172.2pt;height:155.4pt;z-index:251669504;visibility:visible;mso-wrap-style:square;mso-width-percent:0;mso-height-percent:0;mso-wrap-distance-left:9pt;mso-wrap-distance-top:0;mso-wrap-distance-right:9pt;mso-wrap-distance-bottom:0;mso-position-horizontal:left;mso-position-horizontal-relative:margin;mso-position-vertical:absolute;mso-position-vertical-relative:text;mso-width-percent:0;mso-height-percent:0;mso-width-relative:margin;mso-height-relative:margin;v-text-anchor:middle" o:gfxdata="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" fillcolor="black [3200]" strokecolor="black [480]" strokeweight="1pt">
+              <v:rect w14:anchorId="352A97F6" id="Rectangle 10" o:spid="_x0000_s1032" style="position:absolute;left:0;text-align:left;margin-left:0;margin-top:22.1pt;width:172.2pt;height:155.4pt;z-index:251669504;visibility:visible;mso-wrap-style:square;mso-width-percent:0;mso-height-percent:0;mso-wrap-distance-left:9pt;mso-wrap-distance-top:0;mso-wrap-distance-right:9pt;mso-wrap-distance-bottom:0;mso-position-horizontal:left;mso-position-horizontal-relative:margin;mso-position-vertical:absolute;mso-position-vertical-relative:text;mso-width-percent:0;mso-height-percent:0;mso-width-relative:margin;mso-height-relative:margin;v-text-anchor:middle" o:gfxdata="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" fillcolor="black [3200]" strokecolor="black [480]" strokeweight="1pt">
                 <v:textbox>
                   <w:txbxContent>
                     <w:p>
@@ -9534,7 +6797,7 @@
           </mc:Choice>
           <mc:Fallback>
             <w:pict>
-              <v:rect w14:anchorId="23A63E90" id="_x0000_s1035" style="position:absolute;left:0;text-align:left;margin-left:0;margin-top:.6pt;width:172.2pt;height:82.8pt;z-index:251681792;visibility:visible;mso-wrap-style:square;mso-width-percent:0;mso-height-percent:0;mso-wrap-distance-left:9pt;mso-wrap-distance-top:0;mso-wrap-distance-right:9pt;mso-wrap-distance-bottom:0;mso-position-horizontal:left;mso-position-horizontal-relative:margin;mso-position-vertical:absolute;mso-position-vertical-relative:text;mso-width-percent:0;mso-height-percent:0;mso-width-relative:margin;mso-height-relative:margin;v-text-anchor:middle" o:gfxdata="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" fillcolor="black [3200]" strokecolor="black [480]" strokeweight="1pt">
+              <v:rect w14:anchorId="23A63E90" id="_x0000_s1033" style="position:absolute;left:0;text-align:left;margin-left:0;margin-top:.6pt;width:172.2pt;height:82.8pt;z-index:251681792;visibility:visible;mso-wrap-style:square;mso-width-percent:0;mso-height-percent:0;mso-wrap-distance-left:9pt;mso-wrap-distance-top:0;mso-wrap-distance-right:9pt;mso-wrap-distance-bottom:0;mso-position-horizontal:left;mso-position-horizontal-relative:margin;mso-position-vertical:absolute;mso-position-vertical-relative:text;mso-width-percent:0;mso-height-percent:0;mso-width-relative:margin;mso-height-relative:margin;v-text-anchor:middle" o:gfxdata="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" fillcolor="black [3200]" strokecolor="black [480]" strokeweight="1pt">
                 <v:textbox>
                   <w:txbxContent>
                     <w:p>
@@ -10087,16 +7350,7 @@
           <w:sz w:val="28"/>
           <w:szCs w:val="28"/>
         </w:rPr>
-        <w:t xml:space="preserve">For these reasons, Kubernetes best practice is to separate independent services into different Pods and connect them using Services and networking. Multi-container Pods are reserved for cases </w:t>
-      </w:r>
-      <w:r>
-        <w:rPr>
-          <w:rFonts w:asciiTheme="majorBidi" w:hAnsiTheme="majorBidi" w:cstheme="majorBidi"/>
-          <w:sz w:val="28"/>
-          <w:szCs w:val="28"/>
-        </w:rPr>
-        <w:lastRenderedPageBreak/>
-        <w:t>where containers are tightly coupled and must operate together, such as a main application container and a logging or proxy sidecar container.</w:t>
+        <w:t>For these reasons, Kubernetes best practice is to separate independent services into different Pods and connect them using Services and networking. Multi-container Pods are reserved for cases where containers are tightly coupled and must operate together, such as a main application container and a logging or proxy sidecar container.</w:t>
       </w:r>
     </w:p>
     <w:p>
@@ -10247,6 +7501,7 @@
           <w:sz w:val="28"/>
           <w:szCs w:val="28"/>
         </w:rPr>
+        <w:lastRenderedPageBreak/>
         <w:t>Purpose of Init Containers:</w:t>
       </w:r>
     </w:p>
@@ -10640,7 +7895,6 @@
           <w:sz w:val="28"/>
           <w:szCs w:val="28"/>
         </w:rPr>
-        <w:lastRenderedPageBreak/>
         <w:t>Difference Between Init Containers and App Containers</w:t>
       </w:r>
       <w:r>
@@ -11076,6 +8330,7 @@
                 <w:sz w:val="28"/>
                 <w:szCs w:val="28"/>
               </w:rPr>
+              <w:lastRenderedPageBreak/>
               <w:t>Lifespan</w:t>
             </w:r>
           </w:p>
@@ -11839,7 +9094,7 @@
           </mc:Choice>
           <mc:Fallback>
             <w:pict>
-              <v:rect w14:anchorId="53FBABE8" id="Rectangle 11" o:spid="_x0000_s1036" style="position:absolute;left:0;text-align:left;margin-left:0;margin-top:23.2pt;width:390.6pt;height:230.4pt;z-index:251670528;visibility:visible;mso-wrap-style:square;mso-width-percent:0;mso-height-percent:0;mso-wrap-distance-left:9pt;mso-wrap-distance-top:0;mso-wrap-distance-right:9pt;mso-wrap-distance-bottom:0;mso-position-horizontal:left;mso-position-horizontal-relative:margin;mso-position-vertical:absolute;mso-position-vertical-relative:text;mso-width-percent:0;mso-height-percent:0;mso-width-relative:margin;mso-height-relative:margin;v-text-anchor:middle" o:gfxdata="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" fillcolor="black [3200]" strokecolor="black [480]" strokeweight="1pt">
+              <v:rect w14:anchorId="53FBABE8" id="Rectangle 11" o:spid="_x0000_s1034" style="position:absolute;left:0;text-align:left;margin-left:0;margin-top:23.2pt;width:390.6pt;height:230.4pt;z-index:251670528;visibility:visible;mso-wrap-style:square;mso-width-percent:0;mso-height-percent:0;mso-wrap-distance-left:9pt;mso-wrap-distance-top:0;mso-wrap-distance-right:9pt;mso-wrap-distance-bottom:0;mso-position-horizontal:left;mso-position-horizontal-relative:margin;mso-position-vertical:absolute;mso-position-vertical-relative:text;mso-width-percent:0;mso-height-percent:0;mso-width-relative:margin;mso-height-relative:margin;v-text-anchor:middle" o:gfxdata="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" fillcolor="black [3200]" strokecolor="black [480]" strokeweight="1pt">
                 <v:textbox>
                   <w:txbxContent>
                     <w:p>
@@ -12857,7 +10112,6 @@
           <w:sz w:val="28"/>
           <w:szCs w:val="28"/>
         </w:rPr>
-        <w:lastRenderedPageBreak/>
         <w:t xml:space="preserve">The Pod lifecycle describes the sequence of states a Pod goes through from the moment it is created until it is terminated. The lifecycle of a Pod is managed by Kubernetes components such as the </w:t>
       </w:r>
       <w:proofErr w:type="spellStart"/>
@@ -12967,7 +10221,16 @@
           <w:sz w:val="28"/>
           <w:szCs w:val="28"/>
         </w:rPr>
-        <w:t xml:space="preserve"> on that node receives the Pod specification and is responsible for creating and managing the containers defined in the Pod.</w:t>
+        <w:t xml:space="preserve"> on that node receives the Pod specification and is responsible for creating and managing the containers defined </w:t>
+      </w:r>
+      <w:r>
+        <w:rPr>
+          <w:rFonts w:asciiTheme="majorBidi" w:hAnsiTheme="majorBidi" w:cstheme="majorBidi"/>
+          <w:sz w:val="28"/>
+          <w:szCs w:val="28"/>
+        </w:rPr>
+        <w:lastRenderedPageBreak/>
+        <w:t>in the Pod.</w:t>
       </w:r>
       <w:r>
         <w:rPr>
@@ -13335,7 +10598,6 @@
           <w:sz w:val="28"/>
           <w:szCs w:val="28"/>
         </w:rPr>
-        <w:lastRenderedPageBreak/>
         <w:drawing>
           <wp:anchor distT="0" distB="0" distL="114300" distR="114300" simplePos="0" relativeHeight="251671552" behindDoc="1" locked="0" layoutInCell="1" allowOverlap="1" wp14:anchorId="4033D3BA" wp14:editId="11353610">
             <wp:simplePos x="0" y="0"/>
@@ -13515,6 +10777,7 @@
           <w:sz w:val="28"/>
           <w:szCs w:val="28"/>
         </w:rPr>
+        <w:lastRenderedPageBreak/>
         <w:t>The container has not started running yet. This can occur while the container image is being pulled or when dependencies are not yet satisfied.</w:t>
       </w:r>
     </w:p>
@@ -14005,7 +11268,6 @@
           <w:sz w:val="36"/>
           <w:szCs w:val="36"/>
         </w:rPr>
-        <w:lastRenderedPageBreak/>
         <w:t>Pod Startup Errors</w:t>
       </w:r>
       <w:r>
@@ -14217,6 +11479,7 @@
           <w:sz w:val="28"/>
           <w:szCs w:val="28"/>
         </w:rPr>
+        <w:lastRenderedPageBreak/>
         <w:t>The image does not exist in the specified registry</w:t>
       </w:r>
     </w:p>
@@ -14699,7 +11962,6 @@
           <w:sz w:val="28"/>
           <w:szCs w:val="28"/>
         </w:rPr>
-        <w:lastRenderedPageBreak/>
         <w:t>Authentication failure to private registry</w:t>
       </w:r>
     </w:p>
@@ -15004,6 +12266,7 @@
           <w:sz w:val="28"/>
           <w:szCs w:val="28"/>
         </w:rPr>
+        <w:lastRenderedPageBreak/>
         <w:t xml:space="preserve">Use </w:t>
       </w:r>
       <w:proofErr w:type="spellStart"/>
@@ -15715,7 +12978,7 @@
           </mc:Choice>
           <mc:Fallback>
             <w:pict>
-              <v:rect w14:anchorId="62CF282D" id="Rectangle 17" o:spid="_x0000_s1037" style="position:absolute;left:0;text-align:left;margin-left:468.4pt;margin-top:24.95pt;width:519.6pt;height:301.2pt;z-index:251677696;visibility:visible;mso-wrap-style:square;mso-width-percent:0;mso-height-percent:0;mso-wrap-distance-left:9pt;mso-wrap-distance-top:0;mso-wrap-distance-right:9pt;mso-wrap-distance-bottom:0;mso-position-horizontal:right;mso-position-horizontal-relative:margin;mso-position-vertical:absolute;mso-position-vertical-relative:text;mso-width-percent:0;mso-height-percent:0;mso-width-relative:margin;mso-height-relative:margin;v-text-anchor:middle" o:gfxdata="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" fillcolor="#555 [2160]" strokecolor="black [3200]" strokeweight=".5pt">
+              <v:rect w14:anchorId="62CF282D" id="Rectangle 17" o:spid="_x0000_s1035" style="position:absolute;left:0;text-align:left;margin-left:468.4pt;margin-top:24.95pt;width:519.6pt;height:301.2pt;z-index:251677696;visibility:visible;mso-wrap-style:square;mso-width-percent:0;mso-height-percent:0;mso-wrap-distance-left:9pt;mso-wrap-distance-top:0;mso-wrap-distance-right:9pt;mso-wrap-distance-bottom:0;mso-position-horizontal:right;mso-position-horizontal-relative:margin;mso-position-vertical:absolute;mso-position-vertical-relative:text;mso-width-percent:0;mso-height-percent:0;mso-width-relative:margin;mso-height-relative:margin;v-text-anchor:middle" o:gfxdata="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" fillcolor="#555 [2160]" strokecolor="black [3200]" strokeweight=".5pt">
                 <v:fill color2="#313131 [2608]" rotate="t" colors="0 #9b9b9b;.5 #8e8e8e;1 #797979" focus="100%" type="gradient">
                   <o:fill v:ext="view" type="gradientUnscaled"/>
                 </v:fill>
@@ -16187,7 +13450,7 @@
           </mc:Choice>
           <mc:Fallback>
             <w:pict>
-              <v:rect w14:anchorId="584C4832" id="_x0000_s1038" style="position:absolute;margin-left:18.6pt;margin-top:.6pt;width:520.8pt;height:216.6pt;z-index:251679744;visibility:visible;mso-wrap-style:square;mso-width-percent:0;mso-height-percent:0;mso-wrap-distance-left:9pt;mso-wrap-distance-top:0;mso-wrap-distance-right:9pt;mso-wrap-distance-bottom:0;mso-position-horizontal:absolute;mso-position-horizontal-relative:margin;mso-position-vertical:absolute;mso-position-vertical-relative:text;mso-width-percent:0;mso-height-percent:0;mso-width-relative:margin;mso-height-relative:margin;v-text-anchor:middle" o:gfxdata="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" fillcolor="#555 [2160]" strokecolor="black [3200]" strokeweight=".5pt">
+              <v:rect w14:anchorId="584C4832" id="_x0000_s1036" style="position:absolute;margin-left:18.6pt;margin-top:.6pt;width:520.8pt;height:216.6pt;z-index:251679744;visibility:visible;mso-wrap-style:square;mso-width-percent:0;mso-height-percent:0;mso-wrap-distance-left:9pt;mso-wrap-distance-top:0;mso-wrap-distance-right:9pt;mso-wrap-distance-bottom:0;mso-position-horizontal:absolute;mso-position-horizontal-relative:margin;mso-position-vertical:absolute;mso-position-vertical-relative:text;mso-width-percent:0;mso-height-percent:0;mso-width-relative:margin;mso-height-relative:margin;v-text-anchor:middle" o:gfxdata="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" fillcolor="#555 [2160]" strokecolor="black [3200]" strokeweight=".5pt">
                 <v:fill color2="#313131 [2608]" rotate="t" colors="0 #9b9b9b;.5 #8e8e8e;1 #797979" focus="100%" type="gradient">
                   <o:fill v:ext="view" type="gradientUnscaled"/>
                 </v:fill>
@@ -16715,7 +13978,6 @@
           <w:sz w:val="28"/>
           <w:szCs w:val="28"/>
         </w:rPr>
-        <w:lastRenderedPageBreak/>
         <w:t>A Pod in the Pending state has been accepted by the API server but has not yet been scheduled or cannot start.</w:t>
       </w:r>
     </w:p>
@@ -17015,6 +14277,7 @@
           <w:sz w:val="28"/>
           <w:szCs w:val="28"/>
         </w:rPr>
+        <w:lastRenderedPageBreak/>
         <w:t>Node failure or network partition</w:t>
       </w:r>
     </w:p>
@@ -17492,7 +14755,6 @@
           <w:sz w:val="28"/>
           <w:szCs w:val="28"/>
         </w:rPr>
-        <w:lastRenderedPageBreak/>
         <w:t>Always</w:t>
       </w:r>
       <w:r>
@@ -17890,7 +15152,7 @@
           </mc:Choice>
           <mc:Fallback>
             <w:pict>
-              <v:rect w14:anchorId="57A0EB02" id="Rectangle 13" o:spid="_x0000_s1039" style="position:absolute;left:0;text-align:left;margin-left:0;margin-top:23.5pt;width:179.4pt;height:105.6pt;z-index:251672576;visibility:visible;mso-wrap-style:square;mso-width-percent:0;mso-height-percent:0;mso-wrap-distance-left:9pt;mso-wrap-distance-top:0;mso-wrap-distance-right:9pt;mso-wrap-distance-bottom:0;mso-position-horizontal:left;mso-position-horizontal-relative:margin;mso-position-vertical:absolute;mso-position-vertical-relative:text;mso-width-percent:0;mso-height-percent:0;mso-width-relative:margin;mso-height-relative:margin;v-text-anchor:middle" o:gfxdata="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" fillcolor="black [3200]" strokecolor="black [480]" strokeweight="1pt">
+              <v:rect w14:anchorId="57A0EB02" id="Rectangle 13" o:spid="_x0000_s1037" style="position:absolute;left:0;text-align:left;margin-left:0;margin-top:23.5pt;width:179.4pt;height:105.6pt;z-index:251672576;visibility:visible;mso-wrap-style:square;mso-width-percent:0;mso-height-percent:0;mso-wrap-distance-left:9pt;mso-wrap-distance-top:0;mso-wrap-distance-right:9pt;mso-wrap-distance-bottom:0;mso-position-horizontal:left;mso-position-horizontal-relative:margin;mso-position-vertical:absolute;mso-position-vertical-relative:text;mso-width-percent:0;mso-height-percent:0;mso-width-relative:margin;mso-height-relative:margin;v-text-anchor:middle" o:gfxdata="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" fillcolor="black [3200]" strokecolor="black [480]" strokeweight="1pt">
                 <v:textbox>
                   <w:txbxContent>
                     <w:p>
@@ -18325,7 +15587,7 @@
           </mc:Choice>
           <mc:Fallback>
             <w:pict>
-              <v:rect w14:anchorId="75EE192B" id="_x0000_s1040" style="position:absolute;left:0;text-align:left;margin-left:0;margin-top:.85pt;width:179.4pt;height:85.2pt;z-index:251683840;visibility:visible;mso-wrap-style:square;mso-width-percent:0;mso-height-percent:0;mso-wrap-distance-left:9pt;mso-wrap-distance-top:0;mso-wrap-distance-right:9pt;mso-wrap-distance-bottom:0;mso-position-horizontal:left;mso-position-horizontal-relative:margin;mso-position-vertical:absolute;mso-position-vertical-relative:text;mso-width-percent:0;mso-height-percent:0;mso-width-relative:margin;mso-height-relative:margin;v-text-anchor:middle" o:gfxdata="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" fillcolor="black [3200]" strokecolor="black [480]" strokeweight="1pt">
+              <v:rect w14:anchorId="75EE192B" id="_x0000_s1038" style="position:absolute;left:0;text-align:left;margin-left:0;margin-top:.85pt;width:179.4pt;height:85.2pt;z-index:251683840;visibility:visible;mso-wrap-style:square;mso-width-percent:0;mso-height-percent:0;mso-wrap-distance-left:9pt;mso-wrap-distance-top:0;mso-wrap-distance-right:9pt;mso-wrap-distance-bottom:0;mso-position-horizontal:left;mso-position-horizontal-relative:margin;mso-position-vertical:absolute;mso-position-vertical-relative:text;mso-width-percent:0;mso-height-percent:0;mso-width-relative:margin;mso-height-relative:margin;v-text-anchor:middle" o:gfxdata="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" fillcolor="black [3200]" strokecolor="black [480]" strokeweight="1pt">
                 <v:textbox>
                   <w:txbxContent>
                     <w:p>
@@ -18897,7 +16159,6 @@
           <w:sz w:val="28"/>
           <w:szCs w:val="28"/>
         </w:rPr>
-        <w:lastRenderedPageBreak/>
         <w:t>The lifecycle of a Pod typically follows this sequence:</w:t>
       </w:r>
     </w:p>
@@ -20836,7 +18097,7 @@
           </mc:Choice>
           <mc:Fallback>
             <w:pict>
-              <v:rect w14:anchorId="0E33B7EF" id="_x0000_s1041" style="position:absolute;margin-left:0;margin-top:59.6pt;width:419.4pt;height:658.8pt;z-index:251673600;visibility:visible;mso-wrap-style:square;mso-width-percent:0;mso-height-percent:0;mso-wrap-distance-left:9pt;mso-wrap-distance-top:0;mso-wrap-distance-right:9pt;mso-wrap-distance-bottom:0;mso-position-horizontal:left;mso-position-horizontal-relative:margin;mso-position-vertical:absolute;mso-position-vertical-relative:text;mso-width-percent:0;mso-height-percent:0;mso-width-relative:margin;mso-height-relative:margin;v-text-anchor:middle" o:gfxdata="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" fillcolor="black [3200]" strokecolor="black [480]" strokeweight="1pt">
+              <v:rect w14:anchorId="0E33B7EF" id="_x0000_s1039" style="position:absolute;margin-left:0;margin-top:59.6pt;width:419.4pt;height:658.8pt;z-index:251673600;visibility:visible;mso-wrap-style:square;mso-width-percent:0;mso-height-percent:0;mso-wrap-distance-left:9pt;mso-wrap-distance-top:0;mso-wrap-distance-right:9pt;mso-wrap-distance-bottom:0;mso-position-horizontal:left;mso-position-horizontal-relative:margin;mso-position-vertical:absolute;mso-position-vertical-relative:text;mso-width-percent:0;mso-height-percent:0;mso-width-relative:margin;mso-height-relative:margin;v-text-anchor:middle" o:gfxdata="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" fillcolor="black [3200]" strokecolor="black [480]" strokeweight="1pt">
                 <v:textbox>
                   <w:txbxContent>
                     <w:p>
@@ -24038,7 +21299,7 @@
           </mc:Choice>
           <mc:Fallback>
             <w:pict>
-              <v:rect w14:anchorId="34C1C259" id="Rectangle 14" o:spid="_x0000_s1042" style="position:absolute;margin-left:0;margin-top:-.1pt;width:421.8pt;height:511.2pt;z-index:251674624;visibility:visible;mso-wrap-style:square;mso-width-percent:0;mso-height-percent:0;mso-wrap-distance-left:9pt;mso-wrap-distance-top:0;mso-wrap-distance-right:9pt;mso-wrap-distance-bottom:0;mso-position-horizontal:left;mso-position-horizontal-relative:margin;mso-position-vertical:absolute;mso-position-vertical-relative:text;mso-width-percent:0;mso-height-percent:0;mso-width-relative:margin;mso-height-relative:margin;v-text-anchor:middle" o:gfxdata="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" fillcolor="black [3200]" strokecolor="black [480]" strokeweight="1pt">
+              <v:rect w14:anchorId="34C1C259" id="Rectangle 14" o:spid="_x0000_s1040" style="position:absolute;margin-left:0;margin-top:-.1pt;width:421.8pt;height:511.2pt;z-index:251674624;visibility:visible;mso-wrap-style:square;mso-width-percent:0;mso-height-percent:0;mso-wrap-distance-left:9pt;mso-wrap-distance-top:0;mso-wrap-distance-right:9pt;mso-wrap-distance-bottom:0;mso-position-horizontal:left;mso-position-horizontal-relative:margin;mso-position-vertical:absolute;mso-position-vertical-relative:text;mso-width-percent:0;mso-height-percent:0;mso-width-relative:margin;mso-height-relative:margin;v-text-anchor:middle" o:gfxdata="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" fillcolor="black [3200]" strokecolor="black [480]" strokeweight="1pt">
                 <v:textbox>
                   <w:txbxContent>
                     <w:p>
@@ -26014,6 +23275,7 @@
           <w:sz w:val="28"/>
           <w:szCs w:val="28"/>
         </w:rPr>
+        <w:lastRenderedPageBreak/>
         <w:t>Options:</w:t>
       </w:r>
     </w:p>
@@ -26803,7 +24065,6 @@
           <w:sz w:val="32"/>
           <w:szCs w:val="32"/>
         </w:rPr>
-        <w:lastRenderedPageBreak/>
         <w:t>API Server (Cluster Gateway)</w:t>
       </w:r>
     </w:p>
@@ -27211,6 +24472,7 @@
           <w:sz w:val="28"/>
           <w:szCs w:val="28"/>
         </w:rPr>
+        <w:lastRenderedPageBreak/>
         <w:t>Validation</w:t>
       </w:r>
     </w:p>
@@ -27691,7 +24953,7 @@
           </mc:Choice>
           <mc:Fallback>
             <w:pict>
-              <v:rect w14:anchorId="33FCB20B" id="Rectangle 16" o:spid="_x0000_s1043" style="position:absolute;left:0;text-align:left;margin-left:18pt;margin-top:43.1pt;width:173.4pt;height:83.45pt;z-index:251676672;visibility:visible;mso-wrap-style:square;mso-width-percent:0;mso-height-percent:0;mso-wrap-distance-left:9pt;mso-wrap-distance-top:0;mso-wrap-distance-right:9pt;mso-wrap-distance-bottom:0;mso-position-horizontal:absolute;mso-position-horizontal-relative:text;mso-position-vertical:absolute;mso-position-vertical-relative:text;mso-width-percent:0;mso-height-percent:0;mso-width-relative:margin;mso-height-relative:margin;v-text-anchor:middle" o:gfxdata="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" fillcolor="black [3200]" strokecolor="black [480]" strokeweight="1pt">
+              <v:rect w14:anchorId="33FCB20B" id="Rectangle 16" o:spid="_x0000_s1041" style="position:absolute;left:0;text-align:left;margin-left:18pt;margin-top:43.1pt;width:173.4pt;height:83.45pt;z-index:251676672;visibility:visible;mso-wrap-style:square;mso-width-percent:0;mso-height-percent:0;mso-wrap-distance-left:9pt;mso-wrap-distance-top:0;mso-wrap-distance-right:9pt;mso-wrap-distance-bottom:0;mso-position-horizontal:absolute;mso-position-horizontal-relative:text;mso-position-vertical:absolute;mso-position-vertical-relative:text;mso-width-percent:0;mso-height-percent:0;mso-width-relative:margin;mso-height-relative:margin;v-text-anchor:middle" o:gfxdata="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" fillcolor="black [3200]" strokecolor="black [480]" strokeweight="1pt">
                 <v:textbox>
                   <w:txbxContent>
                     <w:p>
@@ -28011,7 +25273,6 @@
           <w:sz w:val="28"/>
           <w:szCs w:val="28"/>
         </w:rPr>
-        <w:lastRenderedPageBreak/>
         <w:t>nodeName</w:t>
       </w:r>
       <w:proofErr w:type="spellEnd"/>
@@ -28375,6 +25636,7 @@
           <w:sz w:val="28"/>
           <w:szCs w:val="28"/>
         </w:rPr>
+        <w:lastRenderedPageBreak/>
         <w:t>Pod Affinity / Anti‑Affinity</w:t>
       </w:r>
     </w:p>
@@ -29010,7 +26272,6 @@
           <w:sz w:val="28"/>
           <w:szCs w:val="28"/>
         </w:rPr>
-        <w:lastRenderedPageBreak/>
         <w:t>Start container process</w:t>
       </w:r>
     </w:p>

</xml_diff>